<commit_message>
[REPO] Maintain aggregate assessment and remove stale playtest gates (#35)
</commit_message>
<xml_diff>
--- a/artifacts/docx/BATCH_LOG.docx
+++ b/artifacts/docx/BATCH_LOG.docx
@@ -2,3103 +2,2137 @@
 <file path=word/document.xml><?xml version="1.0" encoding="utf-8"?>
 <w:document xmlns:wpc="http://schemas.microsoft.com/office/word/2010/wordprocessingCanvas" xmlns:mo="http://schemas.microsoft.com/office/mac/office/2008/main" xmlns:mc="http://schemas.openxmlformats.org/markup-compatibility/2006" xmlns:mv="urn:schemas-microsoft-com:mac:vml" xmlns:o="urn:schemas-microsoft-com:office:office" xmlns:r="http://schemas.openxmlformats.org/officeDocument/2006/relationships" xmlns:m="http://schemas.openxmlformats.org/officeDocument/2006/math" xmlns:v="urn:schemas-microsoft-com:vml" xmlns:wp14="http://schemas.microsoft.com/office/word/2010/wordprocessingDrawing" xmlns:wp="http://schemas.openxmlformats.org/drawingml/2006/wordprocessingDrawing" xmlns:w10="urn:schemas-microsoft-com:office:word" xmlns:w="http://schemas.openxmlformats.org/wordprocessingml/2006/main" xmlns:w14="http://schemas.microsoft.com/office/word/2010/wordml" xmlns:wpg="http://schemas.microsoft.com/office/word/2010/wordprocessingGroup" xmlns:wpi="http://schemas.microsoft.com/office/word/2010/wordprocessingInk" xmlns:wne="http://schemas.microsoft.com/office/word/2006/wordml" xmlns:wps="http://schemas.microsoft.com/office/word/2010/wordprocessingShape" mc:Ignorable="w14 wp14">
   <w:body>
-    <w:p>
-      <w:pPr>
-        <w:jc w:val="center"/>
-      </w:pPr>
-      <w:r>
-        <w:rPr>
-          <w:rFonts w:ascii="Aptos Display" w:hAnsi="Aptos Display"/>
-          <w:b/>
-          <w:color w:val="316273"/>
-          <w:sz w:val="48"/>
-        </w:rPr>
-        <w:t>Batch log</w:t>
-      </w:r>
-    </w:p>
     <w:tbl>
       <w:tblPr>
         <w:tblStyle w:val="TableGrid"/>
-        <w:tblW w:type="dxa" w:w="10166"/>
-        <w:jc w:val="center"/>
-        <w:tblLayout w:type="fixed"/>
+        <w:tblW w:type="auto" w:w="0"/>
         <w:tblLook w:firstColumn="1" w:firstRow="1" w:lastColumn="0" w:lastRow="0" w:noHBand="0" w:noVBand="1" w:val="04A0"/>
-        <w:tblInd w:type="dxa" w:w="120"/>
       </w:tblPr>
       <w:tblGrid>
-        <w:gridCol w:w="2797"/>
-        <w:gridCol w:w="7369"/>
+        <w:gridCol w:w="4320"/>
+        <w:gridCol w:w="4320"/>
       </w:tblGrid>
       <w:tr>
-        <w:trPr>
-          <w:cantSplit/>
-          <w:tblHeader/>
-        </w:trPr>
         <w:tc>
           <w:tcPr>
-            <w:tcW w:type="dxa" w:w="2797"/>
-            <w:shd w:fill="316273"/>
+            <w:tcW w:type="dxa" w:w="4320"/>
           </w:tcPr>
           <w:p>
             <w:r>
-              <w:rPr>
-                <w:rFonts w:ascii="Aptos" w:hAnsi="Aptos"/>
-                <w:b/>
-                <w:color w:val="FFFFFF"/>
-                <w:sz w:val="16"/>
-              </w:rPr>
               <w:t>Document</w:t>
             </w:r>
           </w:p>
         </w:tc>
         <w:tc>
           <w:tcPr>
-            <w:tcW w:type="dxa" w:w="7369"/>
-            <w:shd w:fill="316273"/>
+            <w:tcW w:type="dxa" w:w="4320"/>
           </w:tcPr>
           <w:p>
             <w:r>
-              <w:rPr>
-                <w:rFonts w:ascii="Aptos" w:hAnsi="Aptos"/>
-                <w:b/>
-                <w:color w:val="FFFFFF"/>
-                <w:sz w:val="16"/>
-              </w:rPr>
               <w:t>Zombie Awareness Overhaul Batch Log</w:t>
             </w:r>
           </w:p>
         </w:tc>
       </w:tr>
       <w:tr>
-        <w:trPr>
-          <w:cantSplit/>
-        </w:trPr>
         <w:tc>
           <w:tcPr>
-            <w:tcW w:type="dxa" w:w="2797"/>
+            <w:tcW w:type="dxa" w:w="4320"/>
           </w:tcPr>
           <w:p>
             <w:r>
-              <w:rPr>
-                <w:rFonts w:ascii="Aptos" w:hAnsi="Aptos"/>
-                <w:sz w:val="16"/>
-              </w:rPr>
               <w:t>Version</w:t>
             </w:r>
           </w:p>
         </w:tc>
         <w:tc>
           <w:tcPr>
-            <w:tcW w:type="dxa" w:w="7369"/>
+            <w:tcW w:type="dxa" w:w="4320"/>
           </w:tcPr>
           <w:p>
             <w:r>
-              <w:rPr>
-                <w:rFonts w:ascii="Aptos" w:hAnsi="Aptos"/>
-                <w:sz w:val="16"/>
-              </w:rPr>
-              <w:t>0.5.4.0-pre-alpha</w:t>
+              <w:t>`0.5.4.1-pre-alpha`</w:t>
             </w:r>
           </w:p>
         </w:tc>
       </w:tr>
       <w:tr>
-        <w:trPr>
-          <w:cantSplit/>
-        </w:trPr>
         <w:tc>
           <w:tcPr>
-            <w:tcW w:type="dxa" w:w="2797"/>
-            <w:shd w:fill="EAF1F3"/>
+            <w:tcW w:type="dxa" w:w="4320"/>
           </w:tcPr>
           <w:p>
             <w:r>
-              <w:rPr>
-                <w:rFonts w:ascii="Aptos" w:hAnsi="Aptos"/>
-                <w:sz w:val="16"/>
-              </w:rPr>
               <w:t>Author</w:t>
             </w:r>
           </w:p>
         </w:tc>
         <w:tc>
           <w:tcPr>
-            <w:tcW w:type="dxa" w:w="7369"/>
-            <w:shd w:fill="EAF1F3"/>
+            <w:tcW w:type="dxa" w:w="4320"/>
           </w:tcPr>
           <w:p>
             <w:r>
-              <w:rPr>
-                <w:rFonts w:ascii="Aptos" w:hAnsi="Aptos"/>
-                <w:sz w:val="16"/>
-              </w:rPr>
               <w:t>ellyj3rain</w:t>
             </w:r>
           </w:p>
         </w:tc>
       </w:tr>
       <w:tr>
-        <w:trPr>
-          <w:cantSplit/>
-        </w:trPr>
         <w:tc>
           <w:tcPr>
-            <w:tcW w:type="dxa" w:w="2797"/>
+            <w:tcW w:type="dxa" w:w="4320"/>
           </w:tcPr>
           <w:p>
             <w:r>
-              <w:rPr>
-                <w:rFonts w:ascii="Aptos" w:hAnsi="Aptos"/>
-                <w:sz w:val="16"/>
-              </w:rPr>
               <w:t>Repository</w:t>
             </w:r>
           </w:p>
         </w:tc>
         <w:tc>
           <w:tcPr>
-            <w:tcW w:type="dxa" w:w="7369"/>
+            <w:tcW w:type="dxa" w:w="4320"/>
           </w:tcPr>
           <w:p>
             <w:r>
-              <w:rPr>
-                <w:rFonts w:ascii="Aptos" w:hAnsi="Aptos"/>
-                <w:sz w:val="16"/>
-              </w:rPr>
-              <w:t>BATCH_LOG.md</w:t>
+              <w:t>`BATCH_LOG.md`</w:t>
             </w:r>
           </w:p>
         </w:tc>
       </w:tr>
       <w:tr>
-        <w:trPr>
-          <w:cantSplit/>
-        </w:trPr>
         <w:tc>
           <w:tcPr>
-            <w:tcW w:type="dxa" w:w="2797"/>
-            <w:shd w:fill="EAF1F3"/>
+            <w:tcW w:type="dxa" w:w="4320"/>
           </w:tcPr>
           <w:p>
             <w:r>
-              <w:rPr>
-                <w:rFonts w:ascii="Aptos" w:hAnsi="Aptos"/>
-                <w:sz w:val="16"/>
-              </w:rPr>
               <w:t>Status</w:t>
             </w:r>
           </w:p>
         </w:tc>
         <w:tc>
           <w:tcPr>
-            <w:tcW w:type="dxa" w:w="7369"/>
-            <w:shd w:fill="EAF1F3"/>
+            <w:tcW w:type="dxa" w:w="4320"/>
           </w:tcPr>
           <w:p>
             <w:r>
-              <w:rPr>
-                <w:rFonts w:ascii="Aptos" w:hAnsi="Aptos"/>
-                <w:sz w:val="16"/>
-              </w:rPr>
               <w:t>REGULATORY - chronological batch index.</w:t>
             </w:r>
           </w:p>
         </w:tc>
       </w:tr>
     </w:tbl>
+    <w:p/>
+    <w:p>
+      <w:pPr>
+        <w:pStyle w:val="Heading1"/>
+      </w:pPr>
+      <w:r>
+        <w:t>Batch log</w:t>
+      </w:r>
+    </w:p>
+    <w:p/>
     <w:p>
       <w:r>
-        <w:t>The chronological index of the append-only batch sequence, ZAO's own from A1. Together with the records under Batches/, the decision registry, and the findings ledger, this is the project's portable history; it does not depend on a particular Git host. Batch identifiers share one alphanumeric namespace across letter eras; a letter change does not create another history tree. The last row below is the tip.</w:t>
+        <w:t>The chronological index of the append-only batch sequence, ZAO's own from</w:t>
       </w:r>
     </w:p>
+    <w:p>
+      <w:r>
+        <w:t>`A1`. Together with the records under `Batches/`, the decision registry, and</w:t>
+      </w:r>
+    </w:p>
+    <w:p>
+      <w:r>
+        <w:t>the findings ledger, this is the project's portable history; it does not</w:t>
+      </w:r>
+    </w:p>
+    <w:p>
+      <w:r>
+        <w:t>depend on a particular Git host. Batch identifiers share one alphanumeric</w:t>
+      </w:r>
+    </w:p>
+    <w:p>
+      <w:r>
+        <w:t>namespace across letter eras; a letter change does not create another</w:t>
+      </w:r>
+    </w:p>
+    <w:p>
+      <w:r>
+        <w:t>history tree. The last row below is the tip.</w:t>
+      </w:r>
+    </w:p>
+    <w:p/>
     <w:tbl>
       <w:tblPr>
         <w:tblStyle w:val="TableGrid"/>
-        <w:tblW w:type="dxa" w:w="10166"/>
-        <w:jc w:val="center"/>
-        <w:tblLayout w:type="fixed"/>
+        <w:tblW w:type="auto" w:w="0"/>
         <w:tblLook w:firstColumn="1" w:firstRow="1" w:lastColumn="0" w:lastRow="0" w:noHBand="0" w:noVBand="1" w:val="04A0"/>
-        <w:tblInd w:type="dxa" w:w="120"/>
       </w:tblPr>
       <w:tblGrid>
-        <w:gridCol w:w="1139"/>
-        <w:gridCol w:w="1624"/>
-        <w:gridCol w:w="5548"/>
-        <w:gridCol w:w="1854"/>
+        <w:gridCol w:w="2160"/>
+        <w:gridCol w:w="2160"/>
+        <w:gridCol w:w="2160"/>
+        <w:gridCol w:w="2160"/>
       </w:tblGrid>
       <w:tr>
-        <w:trPr>
-          <w:cantSplit/>
-          <w:tblHeader/>
-        </w:trPr>
         <w:tc>
           <w:tcPr>
-            <w:tcW w:type="dxa" w:w="1139"/>
-            <w:shd w:fill="316273"/>
+            <w:tcW w:type="dxa" w:w="2160"/>
           </w:tcPr>
           <w:p>
             <w:r>
-              <w:rPr>
-                <w:rFonts w:ascii="Aptos" w:hAnsi="Aptos"/>
-                <w:b/>
-                <w:color w:val="FFFFFF"/>
-                <w:sz w:val="16"/>
-              </w:rPr>
               <w:t>Batch</w:t>
             </w:r>
           </w:p>
         </w:tc>
         <w:tc>
           <w:tcPr>
-            <w:tcW w:type="dxa" w:w="1624"/>
-            <w:shd w:fill="316273"/>
+            <w:tcW w:type="dxa" w:w="2160"/>
           </w:tcPr>
           <w:p>
             <w:r>
-              <w:rPr>
-                <w:rFonts w:ascii="Aptos" w:hAnsi="Aptos"/>
-                <w:b/>
-                <w:color w:val="FFFFFF"/>
-                <w:sz w:val="16"/>
-              </w:rPr>
               <w:t>Date</w:t>
             </w:r>
           </w:p>
         </w:tc>
         <w:tc>
           <w:tcPr>
-            <w:tcW w:type="dxa" w:w="5548"/>
-            <w:shd w:fill="316273"/>
+            <w:tcW w:type="dxa" w:w="2160"/>
           </w:tcPr>
           <w:p>
             <w:r>
-              <w:rPr>
-                <w:rFonts w:ascii="Aptos" w:hAnsi="Aptos"/>
-                <w:b/>
-                <w:color w:val="FFFFFF"/>
-                <w:sz w:val="16"/>
-              </w:rPr>
               <w:t>Name</w:t>
             </w:r>
           </w:p>
         </w:tc>
         <w:tc>
           <w:tcPr>
-            <w:tcW w:type="dxa" w:w="1854"/>
-            <w:shd w:fill="316273"/>
+            <w:tcW w:type="dxa" w:w="2160"/>
           </w:tcPr>
           <w:p>
             <w:r>
-              <w:rPr>
-                <w:rFonts w:ascii="Aptos" w:hAnsi="Aptos"/>
-                <w:b/>
-                <w:color w:val="FFFFFF"/>
-                <w:sz w:val="16"/>
-              </w:rPr>
               <w:t>Threads</w:t>
             </w:r>
           </w:p>
         </w:tc>
       </w:tr>
       <w:tr>
-        <w:trPr>
-          <w:cantSplit/>
-        </w:trPr>
         <w:tc>
           <w:tcPr>
-            <w:tcW w:type="dxa" w:w="1139"/>
+            <w:tcW w:type="dxa" w:w="2160"/>
           </w:tcPr>
           <w:p>
             <w:r>
-              <w:rPr>
-                <w:rFonts w:ascii="Aptos" w:hAnsi="Aptos"/>
-                <w:sz w:val="16"/>
-              </w:rPr>
-              <w:t>A1</w:t>
+              <w:t>[A1](Batches/A1-2026-08-29-repository-and-governance-surface.md)</w:t>
             </w:r>
           </w:p>
         </w:tc>
         <w:tc>
           <w:tcPr>
-            <w:tcW w:type="dxa" w:w="1624"/>
+            <w:tcW w:type="dxa" w:w="2160"/>
           </w:tcPr>
           <w:p>
             <w:r>
-              <w:rPr>
-                <w:rFonts w:ascii="Aptos" w:hAnsi="Aptos"/>
-                <w:sz w:val="16"/>
-              </w:rPr>
               <w:t>2026-08-29</w:t>
             </w:r>
           </w:p>
         </w:tc>
         <w:tc>
           <w:tcPr>
-            <w:tcW w:type="dxa" w:w="5548"/>
+            <w:tcW w:type="dxa" w:w="2160"/>
           </w:tcPr>
           <w:p>
             <w:r>
-              <w:rPr>
-                <w:rFonts w:ascii="Aptos" w:hAnsi="Aptos"/>
-                <w:sz w:val="16"/>
-              </w:rPr>
               <w:t>Repository and governance surface</w:t>
             </w:r>
           </w:p>
         </w:tc>
         <w:tc>
           <w:tcPr>
-            <w:tcW w:type="dxa" w:w="1854"/>
+            <w:tcW w:type="dxa" w:w="2160"/>
           </w:tcPr>
           <w:p>
             <w:r>
-              <w:rPr>
-                <w:rFonts w:ascii="Aptos" w:hAnsi="Aptos"/>
-                <w:sz w:val="16"/>
-              </w:rPr>
-              <w:t>T-001</w:t>
+              <w:t>[`T-001`](Batches/THREADS.md#t-001)</w:t>
             </w:r>
           </w:p>
         </w:tc>
       </w:tr>
       <w:tr>
-        <w:trPr>
-          <w:cantSplit/>
-        </w:trPr>
         <w:tc>
           <w:tcPr>
-            <w:tcW w:type="dxa" w:w="1139"/>
-            <w:shd w:fill="EAF1F3"/>
+            <w:tcW w:type="dxa" w:w="2160"/>
           </w:tcPr>
           <w:p>
             <w:r>
-              <w:rPr>
-                <w:rFonts w:ascii="Aptos" w:hAnsi="Aptos"/>
-                <w:sz w:val="16"/>
-              </w:rPr>
-              <w:t>A2</w:t>
+              <w:t>[A2](Batches/A2-2026-08-29-forks-closed-the-sister-and-the-engine-modeled.md)</w:t>
             </w:r>
           </w:p>
         </w:tc>
         <w:tc>
           <w:tcPr>
-            <w:tcW w:type="dxa" w:w="1624"/>
-            <w:shd w:fill="EAF1F3"/>
+            <w:tcW w:type="dxa" w:w="2160"/>
           </w:tcPr>
           <w:p>
             <w:r>
-              <w:rPr>
-                <w:rFonts w:ascii="Aptos" w:hAnsi="Aptos"/>
-                <w:sz w:val="16"/>
-              </w:rPr>
               <w:t>2026-08-29</w:t>
             </w:r>
           </w:p>
         </w:tc>
         <w:tc>
           <w:tcPr>
-            <w:tcW w:type="dxa" w:w="5548"/>
-            <w:shd w:fill="EAF1F3"/>
+            <w:tcW w:type="dxa" w:w="2160"/>
           </w:tcPr>
           <w:p>
             <w:r>
-              <w:rPr>
-                <w:rFonts w:ascii="Aptos" w:hAnsi="Aptos"/>
-                <w:sz w:val="16"/>
-              </w:rPr>
               <w:t>Operator forks closed; the sister and the engine modeled</w:t>
             </w:r>
           </w:p>
         </w:tc>
         <w:tc>
           <w:tcPr>
-            <w:tcW w:type="dxa" w:w="1854"/>
-            <w:shd w:fill="EAF1F3"/>
+            <w:tcW w:type="dxa" w:w="2160"/>
           </w:tcPr>
           <w:p>
             <w:r>
-              <w:rPr>
-                <w:rFonts w:ascii="Aptos" w:hAnsi="Aptos"/>
-                <w:sz w:val="16"/>
-              </w:rPr>
-              <w:t>T-001, T-002</w:t>
+              <w:t>[`T-001`](Batches/THREADS.md#t-001), [`T-002`](Batches/THREADS.md#t-002)</w:t>
             </w:r>
           </w:p>
         </w:tc>
       </w:tr>
       <w:tr>
-        <w:trPr>
-          <w:cantSplit/>
-        </w:trPr>
         <w:tc>
           <w:tcPr>
-            <w:tcW w:type="dxa" w:w="1139"/>
+            <w:tcW w:type="dxa" w:w="2160"/>
           </w:tcPr>
           <w:p>
             <w:r>
-              <w:rPr>
-                <w:rFonts w:ascii="Aptos" w:hAnsi="Aptos"/>
-                <w:sz w:val="16"/>
-              </w:rPr>
-              <w:t>A3</w:t>
+              <w:t>[A3](Batches/A3-2026-08-29-corrections-across-the-seam.md)</w:t>
             </w:r>
           </w:p>
         </w:tc>
         <w:tc>
           <w:tcPr>
-            <w:tcW w:type="dxa" w:w="1624"/>
+            <w:tcW w:type="dxa" w:w="2160"/>
           </w:tcPr>
           <w:p>
             <w:r>
-              <w:rPr>
-                <w:rFonts w:ascii="Aptos" w:hAnsi="Aptos"/>
-                <w:sz w:val="16"/>
-              </w:rPr>
               <w:t>2026-08-29</w:t>
             </w:r>
           </w:p>
         </w:tc>
         <w:tc>
           <w:tcPr>
-            <w:tcW w:type="dxa" w:w="5548"/>
+            <w:tcW w:type="dxa" w:w="2160"/>
           </w:tcPr>
           <w:p>
             <w:r>
-              <w:rPr>
-                <w:rFonts w:ascii="Aptos" w:hAnsi="Aptos"/>
-                <w:sz w:val="16"/>
-              </w:rPr>
               <w:t>Corrections across the seam</w:t>
             </w:r>
           </w:p>
         </w:tc>
         <w:tc>
           <w:tcPr>
-            <w:tcW w:type="dxa" w:w="1854"/>
+            <w:tcW w:type="dxa" w:w="2160"/>
           </w:tcPr>
           <w:p>
             <w:r>
-              <w:rPr>
-                <w:rFonts w:ascii="Aptos" w:hAnsi="Aptos"/>
-                <w:sz w:val="16"/>
-              </w:rPr>
-              <w:t>T-001, T-002</w:t>
+              <w:t>[`T-001`](Batches/THREADS.md#t-001), [`T-002`](Batches/THREADS.md#t-002)</w:t>
             </w:r>
           </w:p>
         </w:tc>
       </w:tr>
       <w:tr>
-        <w:trPr>
-          <w:cantSplit/>
-        </w:trPr>
         <w:tc>
           <w:tcPr>
-            <w:tcW w:type="dxa" w:w="1139"/>
-            <w:shd w:fill="EAF1F3"/>
+            <w:tcW w:type="dxa" w:w="2160"/>
           </w:tcPr>
           <w:p>
             <w:r>
-              <w:rPr>
-                <w:rFonts w:ascii="Aptos" w:hAnsi="Aptos"/>
-                <w:sz w:val="16"/>
-              </w:rPr>
-              <w:t>A4</w:t>
+              <w:t>[A4](Batches/A4-2026-09-08-the-repository-is-published-and-ci-runs-the-gate.md)</w:t>
             </w:r>
           </w:p>
         </w:tc>
         <w:tc>
           <w:tcPr>
-            <w:tcW w:type="dxa" w:w="1624"/>
-            <w:shd w:fill="EAF1F3"/>
+            <w:tcW w:type="dxa" w:w="2160"/>
           </w:tcPr>
           <w:p>
             <w:r>
-              <w:rPr>
-                <w:rFonts w:ascii="Aptos" w:hAnsi="Aptos"/>
-                <w:sz w:val="16"/>
-              </w:rPr>
               <w:t>2026-09-08</w:t>
             </w:r>
           </w:p>
         </w:tc>
         <w:tc>
           <w:tcPr>
-            <w:tcW w:type="dxa" w:w="5548"/>
-            <w:shd w:fill="EAF1F3"/>
+            <w:tcW w:type="dxa" w:w="2160"/>
           </w:tcPr>
           <w:p>
             <w:r>
-              <w:rPr>
-                <w:rFonts w:ascii="Aptos" w:hAnsi="Aptos"/>
-                <w:sz w:val="16"/>
-              </w:rPr>
               <w:t>The repository is published and CI runs the gate</w:t>
             </w:r>
           </w:p>
         </w:tc>
         <w:tc>
           <w:tcPr>
-            <w:tcW w:type="dxa" w:w="1854"/>
-            <w:shd w:fill="EAF1F3"/>
+            <w:tcW w:type="dxa" w:w="2160"/>
           </w:tcPr>
           <w:p>
             <w:r>
-              <w:rPr>
-                <w:rFonts w:ascii="Aptos" w:hAnsi="Aptos"/>
-                <w:sz w:val="16"/>
-              </w:rPr>
-              <w:t>T-001</w:t>
+              <w:t>[`T-001`](Batches/THREADS.md#t-001)</w:t>
             </w:r>
           </w:p>
         </w:tc>
       </w:tr>
       <w:tr>
-        <w:trPr>
-          <w:cantSplit/>
-        </w:trPr>
         <w:tc>
           <w:tcPr>
-            <w:tcW w:type="dxa" w:w="1139"/>
+            <w:tcW w:type="dxa" w:w="2160"/>
           </w:tcPr>
           <w:p>
             <w:r>
-              <w:rPr>
-                <w:rFonts w:ascii="Aptos" w:hAnsi="Aptos"/>
-                <w:sz w:val="16"/>
-              </w:rPr>
-              <w:t>A5</w:t>
+              <w:t>[A5](Batches/A5-2026-09-09-the-turned-body-control-surface-and-the-players-own-dials.md)</w:t>
             </w:r>
           </w:p>
         </w:tc>
         <w:tc>
           <w:tcPr>
-            <w:tcW w:type="dxa" w:w="1624"/>
+            <w:tcW w:type="dxa" w:w="2160"/>
           </w:tcPr>
           <w:p>
             <w:r>
-              <w:rPr>
-                <w:rFonts w:ascii="Aptos" w:hAnsi="Aptos"/>
-                <w:sz w:val="16"/>
-              </w:rPr>
               <w:t>2026-09-09</w:t>
             </w:r>
           </w:p>
         </w:tc>
         <w:tc>
           <w:tcPr>
-            <w:tcW w:type="dxa" w:w="5548"/>
+            <w:tcW w:type="dxa" w:w="2160"/>
           </w:tcPr>
           <w:p>
             <w:r>
-              <w:rPr>
-                <w:rFonts w:ascii="Aptos" w:hAnsi="Aptos"/>
-                <w:sz w:val="16"/>
-              </w:rPr>
               <w:t>The turned body's control surface, and the player's own dials</w:t>
             </w:r>
           </w:p>
         </w:tc>
         <w:tc>
           <w:tcPr>
-            <w:tcW w:type="dxa" w:w="1854"/>
+            <w:tcW w:type="dxa" w:w="2160"/>
           </w:tcPr>
           <w:p>
             <w:r>
-              <w:rPr>
-                <w:rFonts w:ascii="Aptos" w:hAnsi="Aptos"/>
-                <w:sz w:val="16"/>
-              </w:rPr>
-              <w:t>T-002, T-001</w:t>
+              <w:t>[`T-002`](Batches/THREADS.md#t-002), [`T-001`](Batches/THREADS.md#t-001)</w:t>
             </w:r>
           </w:p>
         </w:tc>
       </w:tr>
       <w:tr>
-        <w:trPr>
-          <w:cantSplit/>
-        </w:trPr>
         <w:tc>
           <w:tcPr>
-            <w:tcW w:type="dxa" w:w="1139"/>
-            <w:shd w:fill="EAF1F3"/>
+            <w:tcW w:type="dxa" w:w="2160"/>
           </w:tcPr>
           <w:p>
             <w:r>
-              <w:rPr>
-                <w:rFonts w:ascii="Aptos" w:hAnsi="Aptos"/>
-                <w:sz w:val="16"/>
-              </w:rPr>
-              <w:t>A6</w:t>
+              <w:t>[A6](Batches/A6-2026-09-09-antibodies-is-installed-and-g0-closes.md)</w:t>
             </w:r>
           </w:p>
         </w:tc>
         <w:tc>
           <w:tcPr>
-            <w:tcW w:type="dxa" w:w="1624"/>
-            <w:shd w:fill="EAF1F3"/>
+            <w:tcW w:type="dxa" w:w="2160"/>
           </w:tcPr>
           <w:p>
             <w:r>
-              <w:rPr>
-                <w:rFonts w:ascii="Aptos" w:hAnsi="Aptos"/>
-                <w:sz w:val="16"/>
-              </w:rPr>
               <w:t>2026-09-09</w:t>
             </w:r>
           </w:p>
         </w:tc>
         <w:tc>
           <w:tcPr>
-            <w:tcW w:type="dxa" w:w="5548"/>
-            <w:shd w:fill="EAF1F3"/>
+            <w:tcW w:type="dxa" w:w="2160"/>
           </w:tcPr>
           <w:p>
             <w:r>
-              <w:rPr>
-                <w:rFonts w:ascii="Aptos" w:hAnsi="Aptos"/>
-                <w:sz w:val="16"/>
-              </w:rPr>
               <w:t>Antibodies is installed, and G0 closes</w:t>
             </w:r>
           </w:p>
         </w:tc>
         <w:tc>
           <w:tcPr>
-            <w:tcW w:type="dxa" w:w="1854"/>
-            <w:shd w:fill="EAF1F3"/>
+            <w:tcW w:type="dxa" w:w="2160"/>
           </w:tcPr>
           <w:p>
             <w:r>
-              <w:rPr>
-                <w:rFonts w:ascii="Aptos" w:hAnsi="Aptos"/>
-                <w:sz w:val="16"/>
-              </w:rPr>
-              <w:t>T-002, T-001</w:t>
+              <w:t>[`T-002`](Batches/THREADS.md#t-002), [`T-001`](Batches/THREADS.md#t-001)</w:t>
             </w:r>
           </w:p>
         </w:tc>
       </w:tr>
       <w:tr>
-        <w:trPr>
-          <w:cantSplit/>
-        </w:trPr>
         <w:tc>
           <w:tcPr>
-            <w:tcW w:type="dxa" w:w="1139"/>
+            <w:tcW w:type="dxa" w:w="2160"/>
           </w:tcPr>
           <w:p>
             <w:r>
-              <w:rPr>
-                <w:rFonts w:ascii="Aptos" w:hAnsi="Aptos"/>
-                <w:sz w:val="16"/>
-              </w:rPr>
-              <w:t>A7</w:t>
+              <w:t>[A7](Batches/A7-2026-09-09-a-second-mod-runs-behaviour-on-turned-bodies.md)</w:t>
             </w:r>
           </w:p>
         </w:tc>
         <w:tc>
           <w:tcPr>
-            <w:tcW w:type="dxa" w:w="1624"/>
+            <w:tcW w:type="dxa" w:w="2160"/>
           </w:tcPr>
           <w:p>
             <w:r>
-              <w:rPr>
-                <w:rFonts w:ascii="Aptos" w:hAnsi="Aptos"/>
-                <w:sz w:val="16"/>
-              </w:rPr>
               <w:t>2026-09-09</w:t>
             </w:r>
           </w:p>
         </w:tc>
         <w:tc>
           <w:tcPr>
-            <w:tcW w:type="dxa" w:w="5548"/>
+            <w:tcW w:type="dxa" w:w="2160"/>
           </w:tcPr>
           <w:p>
             <w:r>
-              <w:rPr>
-                <w:rFonts w:ascii="Aptos" w:hAnsi="Aptos"/>
-                <w:sz w:val="16"/>
-              </w:rPr>
               <w:t>A second mod runs behaviour on turned bodies, and publishes a claim API</w:t>
             </w:r>
           </w:p>
         </w:tc>
         <w:tc>
           <w:tcPr>
-            <w:tcW w:type="dxa" w:w="1854"/>
+            <w:tcW w:type="dxa" w:w="2160"/>
           </w:tcPr>
           <w:p>
             <w:r>
-              <w:rPr>
-                <w:rFonts w:ascii="Aptos" w:hAnsi="Aptos"/>
-                <w:sz w:val="16"/>
-              </w:rPr>
-              <w:t>T-002, T-001</w:t>
+              <w:t>[`T-002`](Batches/THREADS.md#t-002), [`T-001`](Batches/THREADS.md#t-001)</w:t>
             </w:r>
           </w:p>
         </w:tc>
       </w:tr>
       <w:tr>
-        <w:trPr>
-          <w:cantSplit/>
-        </w:trPr>
         <w:tc>
           <w:tcPr>
-            <w:tcW w:type="dxa" w:w="1139"/>
-            <w:shd w:fill="EAF1F3"/>
+            <w:tcW w:type="dxa" w:w="2160"/>
           </w:tcPr>
           <w:p>
             <w:r>
-              <w:rPr>
-                <w:rFonts w:ascii="Aptos" w:hAnsi="Aptos"/>
-                <w:sz w:val="16"/>
-              </w:rPr>
-              <w:t>A8</w:t>
+              <w:t>[A8](Batches/A8-2026-09-09-a-claim-on-a-body-is-released-at-the-turn.md)</w:t>
             </w:r>
           </w:p>
         </w:tc>
         <w:tc>
           <w:tcPr>
-            <w:tcW w:type="dxa" w:w="1624"/>
-            <w:shd w:fill="EAF1F3"/>
+            <w:tcW w:type="dxa" w:w="2160"/>
           </w:tcPr>
           <w:p>
             <w:r>
-              <w:rPr>
-                <w:rFonts w:ascii="Aptos" w:hAnsi="Aptos"/>
-                <w:sz w:val="16"/>
-              </w:rPr>
               <w:t>2026-09-09</w:t>
             </w:r>
           </w:p>
         </w:tc>
         <w:tc>
           <w:tcPr>
-            <w:tcW w:type="dxa" w:w="5548"/>
-            <w:shd w:fill="EAF1F3"/>
+            <w:tcW w:type="dxa" w:w="2160"/>
           </w:tcPr>
           <w:p>
             <w:r>
-              <w:rPr>
-                <w:rFonts w:ascii="Aptos" w:hAnsi="Aptos"/>
-                <w:sz w:val="16"/>
-              </w:rPr>
               <w:t>A claim on a body is released at the turn</w:t>
             </w:r>
           </w:p>
         </w:tc>
         <w:tc>
           <w:tcPr>
-            <w:tcW w:type="dxa" w:w="1854"/>
-            <w:shd w:fill="EAF1F3"/>
+            <w:tcW w:type="dxa" w:w="2160"/>
           </w:tcPr>
           <w:p>
             <w:r>
-              <w:rPr>
-                <w:rFonts w:ascii="Aptos" w:hAnsi="Aptos"/>
-                <w:sz w:val="16"/>
-              </w:rPr>
-              <w:t>T-002, T-001</w:t>
+              <w:t>[`T-002`](Batches/THREADS.md#t-002), [`T-001`](Batches/THREADS.md#t-001)</w:t>
             </w:r>
           </w:p>
         </w:tc>
       </w:tr>
       <w:tr>
-        <w:trPr>
-          <w:cantSplit/>
-        </w:trPr>
         <w:tc>
           <w:tcPr>
-            <w:tcW w:type="dxa" w:w="1139"/>
+            <w:tcW w:type="dxa" w:w="2160"/>
           </w:tcPr>
           <w:p>
             <w:r>
-              <w:rPr>
-                <w:rFonts w:ascii="Aptos" w:hAnsi="Aptos"/>
-                <w:sz w:val="16"/>
-              </w:rPr>
-              <w:t>A9</w:t>
+              <w:t>[A9](Batches/A9-2026-09-09-the-integration-posture-and-attribution-per-source.md)</w:t>
             </w:r>
           </w:p>
         </w:tc>
         <w:tc>
           <w:tcPr>
-            <w:tcW w:type="dxa" w:w="1624"/>
+            <w:tcW w:type="dxa" w:w="2160"/>
           </w:tcPr>
           <w:p>
             <w:r>
-              <w:rPr>
-                <w:rFonts w:ascii="Aptos" w:hAnsi="Aptos"/>
-                <w:sz w:val="16"/>
-              </w:rPr>
               <w:t>2026-09-09</w:t>
             </w:r>
           </w:p>
         </w:tc>
         <w:tc>
           <w:tcPr>
-            <w:tcW w:type="dxa" w:w="5548"/>
+            <w:tcW w:type="dxa" w:w="2160"/>
           </w:tcPr>
           <w:p>
             <w:r>
-              <w:rPr>
-                <w:rFonts w:ascii="Aptos" w:hAnsi="Aptos"/>
-                <w:sz w:val="16"/>
-              </w:rPr>
               <w:t>The integration posture, and attribution per source</w:t>
             </w:r>
           </w:p>
         </w:tc>
         <w:tc>
           <w:tcPr>
-            <w:tcW w:type="dxa" w:w="1854"/>
+            <w:tcW w:type="dxa" w:w="2160"/>
           </w:tcPr>
           <w:p>
             <w:r>
-              <w:rPr>
-                <w:rFonts w:ascii="Aptos" w:hAnsi="Aptos"/>
-                <w:sz w:val="16"/>
-              </w:rPr>
-              <w:t>T-001, T-002</w:t>
+              <w:t>[`T-001`](Batches/THREADS.md#t-001), [`T-002`](Batches/THREADS.md#t-002)</w:t>
             </w:r>
           </w:p>
         </w:tc>
       </w:tr>
       <w:tr>
-        <w:trPr>
-          <w:cantSplit/>
-        </w:trPr>
         <w:tc>
           <w:tcPr>
-            <w:tcW w:type="dxa" w:w="1139"/>
-            <w:shd w:fill="EAF1F3"/>
+            <w:tcW w:type="dxa" w:w="2160"/>
           </w:tcPr>
           <w:p>
             <w:r>
-              <w:rPr>
-                <w:rFonts w:ascii="Aptos" w:hAnsi="Aptos"/>
-                <w:sz w:val="16"/>
-              </w:rPr>
-              <w:t>A10</w:t>
+              <w:t>[A10](Batches/A10-2026-09-09-the-actuators-are-java-side.md)</w:t>
             </w:r>
           </w:p>
         </w:tc>
         <w:tc>
           <w:tcPr>
-            <w:tcW w:type="dxa" w:w="1624"/>
-            <w:shd w:fill="EAF1F3"/>
+            <w:tcW w:type="dxa" w:w="2160"/>
           </w:tcPr>
           <w:p>
             <w:r>
-              <w:rPr>
-                <w:rFonts w:ascii="Aptos" w:hAnsi="Aptos"/>
-                <w:sz w:val="16"/>
-              </w:rPr>
               <w:t>2026-09-09</w:t>
             </w:r>
           </w:p>
         </w:tc>
         <w:tc>
           <w:tcPr>
-            <w:tcW w:type="dxa" w:w="5548"/>
-            <w:shd w:fill="EAF1F3"/>
+            <w:tcW w:type="dxa" w:w="2160"/>
           </w:tcPr>
           <w:p>
             <w:r>
-              <w:rPr>
-                <w:rFonts w:ascii="Aptos" w:hAnsi="Aptos"/>
-                <w:sz w:val="16"/>
-              </w:rPr>
               <w:t>The actuators are Java-side</w:t>
             </w:r>
           </w:p>
         </w:tc>
         <w:tc>
           <w:tcPr>
-            <w:tcW w:type="dxa" w:w="1854"/>
-            <w:shd w:fill="EAF1F3"/>
+            <w:tcW w:type="dxa" w:w="2160"/>
           </w:tcPr>
           <w:p>
             <w:r>
-              <w:rPr>
-                <w:rFonts w:ascii="Aptos" w:hAnsi="Aptos"/>
-                <w:sz w:val="16"/>
-              </w:rPr>
-              <w:t>T-002, T-001</w:t>
+              <w:t>[`T-002`](Batches/THREADS.md#t-002), [`T-001`](Batches/THREADS.md#t-001)</w:t>
             </w:r>
           </w:p>
         </w:tc>
       </w:tr>
       <w:tr>
-        <w:trPr>
-          <w:cantSplit/>
-        </w:trPr>
         <w:tc>
           <w:tcPr>
-            <w:tcW w:type="dxa" w:w="1139"/>
+            <w:tcW w:type="dxa" w:w="2160"/>
           </w:tcPr>
           <w:p>
             <w:r>
-              <w:rPr>
-                <w:rFonts w:ascii="Aptos" w:hAnsi="Aptos"/>
-                <w:sz w:val="16"/>
-              </w:rPr>
-              <w:t>A11</w:t>
+              <w:t>[A11](Batches/A11-2026-09-09-the-mutation-system-defined.md)</w:t>
             </w:r>
           </w:p>
         </w:tc>
         <w:tc>
           <w:tcPr>
-            <w:tcW w:type="dxa" w:w="1624"/>
+            <w:tcW w:type="dxa" w:w="2160"/>
           </w:tcPr>
           <w:p>
             <w:r>
-              <w:rPr>
-                <w:rFonts w:ascii="Aptos" w:hAnsi="Aptos"/>
-                <w:sz w:val="16"/>
-              </w:rPr>
               <w:t>2026-09-09</w:t>
             </w:r>
           </w:p>
         </w:tc>
         <w:tc>
           <w:tcPr>
-            <w:tcW w:type="dxa" w:w="5548"/>
+            <w:tcW w:type="dxa" w:w="2160"/>
           </w:tcPr>
           <w:p>
             <w:r>
-              <w:rPr>
-                <w:rFonts w:ascii="Aptos" w:hAnsi="Aptos"/>
-                <w:sz w:val="16"/>
-              </w:rPr>
               <w:t>The mutation system defined</w:t>
             </w:r>
           </w:p>
         </w:tc>
         <w:tc>
           <w:tcPr>
-            <w:tcW w:type="dxa" w:w="1854"/>
+            <w:tcW w:type="dxa" w:w="2160"/>
           </w:tcPr>
           <w:p>
             <w:r>
-              <w:rPr>
-                <w:rFonts w:ascii="Aptos" w:hAnsi="Aptos"/>
-                <w:sz w:val="16"/>
-              </w:rPr>
-              <w:t>T-002, T-001</w:t>
+              <w:t>[`T-002`](Batches/THREADS.md#t-002), [`T-001`](Batches/THREADS.md#t-001)</w:t>
             </w:r>
           </w:p>
         </w:tc>
       </w:tr>
       <w:tr>
-        <w:trPr>
-          <w:cantSplit/>
-        </w:trPr>
         <w:tc>
           <w:tcPr>
-            <w:tcW w:type="dxa" w:w="1139"/>
-            <w:shd w:fill="EAF1F3"/>
+            <w:tcW w:type="dxa" w:w="2160"/>
           </w:tcPr>
           <w:p>
             <w:r>
-              <w:rPr>
-                <w:rFonts w:ascii="Aptos" w:hAnsi="Aptos"/>
-                <w:sz w:val="16"/>
-              </w:rPr>
-              <w:t>A12</w:t>
+              <w:t>[A12](Batches/A12-2026-09-09-the-second-seam-defined.md)</w:t>
             </w:r>
           </w:p>
         </w:tc>
         <w:tc>
           <w:tcPr>
-            <w:tcW w:type="dxa" w:w="1624"/>
-            <w:shd w:fill="EAF1F3"/>
+            <w:tcW w:type="dxa" w:w="2160"/>
           </w:tcPr>
           <w:p>
             <w:r>
-              <w:rPr>
-                <w:rFonts w:ascii="Aptos" w:hAnsi="Aptos"/>
-                <w:sz w:val="16"/>
-              </w:rPr>
               <w:t>2026-09-09</w:t>
             </w:r>
           </w:p>
         </w:tc>
         <w:tc>
           <w:tcPr>
-            <w:tcW w:type="dxa" w:w="5548"/>
-            <w:shd w:fill="EAF1F3"/>
+            <w:tcW w:type="dxa" w:w="2160"/>
           </w:tcPr>
           <w:p>
             <w:r>
-              <w:rPr>
-                <w:rFonts w:ascii="Aptos" w:hAnsi="Aptos"/>
-                <w:sz w:val="16"/>
-              </w:rPr>
               <w:t>The second seam defined</w:t>
             </w:r>
           </w:p>
         </w:tc>
         <w:tc>
           <w:tcPr>
-            <w:tcW w:type="dxa" w:w="1854"/>
-            <w:shd w:fill="EAF1F3"/>
+            <w:tcW w:type="dxa" w:w="2160"/>
           </w:tcPr>
           <w:p>
             <w:r>
-              <w:rPr>
-                <w:rFonts w:ascii="Aptos" w:hAnsi="Aptos"/>
-                <w:sz w:val="16"/>
-              </w:rPr>
-              <w:t>T-002, T-001</w:t>
+              <w:t>[`T-002`](Batches/THREADS.md#t-002), [`T-001`](Batches/THREADS.md#t-001)</w:t>
             </w:r>
           </w:p>
         </w:tc>
       </w:tr>
       <w:tr>
-        <w:trPr>
-          <w:cantSplit/>
-        </w:trPr>
         <w:tc>
           <w:tcPr>
-            <w:tcW w:type="dxa" w:w="1139"/>
+            <w:tcW w:type="dxa" w:w="2160"/>
           </w:tcPr>
           <w:p>
             <w:r>
-              <w:rPr>
-                <w:rFonts w:ascii="Aptos" w:hAnsi="Aptos"/>
-                <w:sz w:val="16"/>
-              </w:rPr>
-              <w:t>A13</w:t>
+              <w:t>[A13](Batches/A13-2026-09-09-the-seam-carries-the-driving-map.md)</w:t>
             </w:r>
           </w:p>
         </w:tc>
         <w:tc>
           <w:tcPr>
-            <w:tcW w:type="dxa" w:w="1624"/>
+            <w:tcW w:type="dxa" w:w="2160"/>
           </w:tcPr>
           <w:p>
             <w:r>
-              <w:rPr>
-                <w:rFonts w:ascii="Aptos" w:hAnsi="Aptos"/>
-                <w:sz w:val="16"/>
-              </w:rPr>
               <w:t>2026-09-09</w:t>
             </w:r>
           </w:p>
         </w:tc>
         <w:tc>
           <w:tcPr>
-            <w:tcW w:type="dxa" w:w="5548"/>
+            <w:tcW w:type="dxa" w:w="2160"/>
           </w:tcPr>
           <w:p>
             <w:r>
-              <w:rPr>
-                <w:rFonts w:ascii="Aptos" w:hAnsi="Aptos"/>
-                <w:sz w:val="16"/>
-              </w:rPr>
               <w:t>The seam carries the driving map</w:t>
             </w:r>
           </w:p>
         </w:tc>
         <w:tc>
           <w:tcPr>
-            <w:tcW w:type="dxa" w:w="1854"/>
+            <w:tcW w:type="dxa" w:w="2160"/>
           </w:tcPr>
           <w:p>
             <w:r>
-              <w:rPr>
-                <w:rFonts w:ascii="Aptos" w:hAnsi="Aptos"/>
-                <w:sz w:val="16"/>
-              </w:rPr>
-              <w:t>T-001, T-002</w:t>
+              <w:t>[`T-001`](Batches/THREADS.md#t-001), [`T-002`](Batches/THREADS.md#t-002)</w:t>
             </w:r>
           </w:p>
         </w:tc>
       </w:tr>
       <w:tr>
-        <w:trPr>
-          <w:cantSplit/>
-        </w:trPr>
         <w:tc>
           <w:tcPr>
-            <w:tcW w:type="dxa" w:w="1139"/>
-            <w:shd w:fill="EAF1F3"/>
+            <w:tcW w:type="dxa" w:w="2160"/>
           </w:tcPr>
           <w:p>
             <w:r>
-              <w:rPr>
-                <w:rFonts w:ascii="Aptos" w:hAnsi="Aptos"/>
-                <w:sz w:val="16"/>
-              </w:rPr>
-              <w:t>A14</w:t>
+              <w:t>[A14](Batches/A14-2026-09-11-the-invented-gate-is-removed.md)</w:t>
             </w:r>
           </w:p>
         </w:tc>
         <w:tc>
           <w:tcPr>
-            <w:tcW w:type="dxa" w:w="1624"/>
-            <w:shd w:fill="EAF1F3"/>
+            <w:tcW w:type="dxa" w:w="2160"/>
           </w:tcPr>
           <w:p>
             <w:r>
-              <w:rPr>
-                <w:rFonts w:ascii="Aptos" w:hAnsi="Aptos"/>
-                <w:sz w:val="16"/>
-              </w:rPr>
               <w:t>2026-09-11</w:t>
             </w:r>
           </w:p>
         </w:tc>
         <w:tc>
           <w:tcPr>
-            <w:tcW w:type="dxa" w:w="5548"/>
-            <w:shd w:fill="EAF1F3"/>
+            <w:tcW w:type="dxa" w:w="2160"/>
           </w:tcPr>
           <w:p>
             <w:r>
-              <w:rPr>
-                <w:rFonts w:ascii="Aptos" w:hAnsi="Aptos"/>
-                <w:sz w:val="16"/>
-              </w:rPr>
               <w:t>The invented gate is removed</w:t>
             </w:r>
           </w:p>
         </w:tc>
         <w:tc>
           <w:tcPr>
-            <w:tcW w:type="dxa" w:w="1854"/>
-            <w:shd w:fill="EAF1F3"/>
+            <w:tcW w:type="dxa" w:w="2160"/>
           </w:tcPr>
           <w:p>
             <w:r>
-              <w:rPr>
-                <w:rFonts w:ascii="Aptos" w:hAnsi="Aptos"/>
-                <w:sz w:val="16"/>
-              </w:rPr>
-              <w:t>T-001, T-002</w:t>
+              <w:t>[`T-001`](Batches/THREADS.md#t-001), [`T-002`](Batches/THREADS.md#t-002)</w:t>
             </w:r>
           </w:p>
         </w:tc>
       </w:tr>
       <w:tr>
-        <w:trPr>
-          <w:cantSplit/>
-        </w:trPr>
         <w:tc>
           <w:tcPr>
-            <w:tcW w:type="dxa" w:w="1139"/>
+            <w:tcW w:type="dxa" w:w="2160"/>
           </w:tcPr>
           <w:p>
             <w:r>
-              <w:rPr>
-                <w:rFonts w:ascii="Aptos" w:hAnsi="Aptos"/>
-                <w:sz w:val="16"/>
-              </w:rPr>
-              <w:t>A15</w:t>
+              <w:t>[A15](Batches/A15-2026-09-11-the-remaining-gate-claims-are-removed.md)</w:t>
             </w:r>
           </w:p>
         </w:tc>
         <w:tc>
           <w:tcPr>
-            <w:tcW w:type="dxa" w:w="1624"/>
+            <w:tcW w:type="dxa" w:w="2160"/>
           </w:tcPr>
           <w:p>
             <w:r>
-              <w:rPr>
-                <w:rFonts w:ascii="Aptos" w:hAnsi="Aptos"/>
-                <w:sz w:val="16"/>
-              </w:rPr>
               <w:t>2026-09-11</w:t>
             </w:r>
           </w:p>
         </w:tc>
         <w:tc>
           <w:tcPr>
-            <w:tcW w:type="dxa" w:w="5548"/>
+            <w:tcW w:type="dxa" w:w="2160"/>
           </w:tcPr>
           <w:p>
             <w:r>
-              <w:rPr>
-                <w:rFonts w:ascii="Aptos" w:hAnsi="Aptos"/>
-                <w:sz w:val="16"/>
-              </w:rPr>
               <w:t>The remaining gate claims are removed</w:t>
             </w:r>
           </w:p>
         </w:tc>
         <w:tc>
           <w:tcPr>
-            <w:tcW w:type="dxa" w:w="1854"/>
+            <w:tcW w:type="dxa" w:w="2160"/>
           </w:tcPr>
           <w:p>
             <w:r>
-              <w:rPr>
-                <w:rFonts w:ascii="Aptos" w:hAnsi="Aptos"/>
-                <w:sz w:val="16"/>
-              </w:rPr>
-              <w:t>T-001, T-002</w:t>
+              <w:t>[`T-001`](Batches/THREADS.md#t-001), [`T-002`](Batches/THREADS.md#t-002)</w:t>
             </w:r>
           </w:p>
         </w:tc>
       </w:tr>
       <w:tr>
-        <w:trPr>
-          <w:cantSplit/>
-        </w:trPr>
         <w:tc>
           <w:tcPr>
-            <w:tcW w:type="dxa" w:w="1139"/>
-            <w:shd w:fill="EAF1F3"/>
+            <w:tcW w:type="dxa" w:w="2160"/>
           </w:tcPr>
           <w:p>
             <w:r>
-              <w:rPr>
-                <w:rFonts w:ascii="Aptos" w:hAnsi="Aptos"/>
-                <w:sz w:val="16"/>
-              </w:rPr>
-              <w:t>A16</w:t>
+              <w:t>[A16](Batches/A16-2026-09-11-the-operators-mutation-rulings-are-recorded.md)</w:t>
             </w:r>
           </w:p>
         </w:tc>
         <w:tc>
           <w:tcPr>
-            <w:tcW w:type="dxa" w:w="1624"/>
-            <w:shd w:fill="EAF1F3"/>
+            <w:tcW w:type="dxa" w:w="2160"/>
           </w:tcPr>
           <w:p>
             <w:r>
-              <w:rPr>
-                <w:rFonts w:ascii="Aptos" w:hAnsi="Aptos"/>
-                <w:sz w:val="16"/>
-              </w:rPr>
               <w:t>2026-09-11</w:t>
             </w:r>
           </w:p>
         </w:tc>
         <w:tc>
           <w:tcPr>
-            <w:tcW w:type="dxa" w:w="5548"/>
-            <w:shd w:fill="EAF1F3"/>
+            <w:tcW w:type="dxa" w:w="2160"/>
           </w:tcPr>
           <w:p>
             <w:r>
-              <w:rPr>
-                <w:rFonts w:ascii="Aptos" w:hAnsi="Aptos"/>
-                <w:sz w:val="16"/>
-              </w:rPr>
               <w:t>The operator's mutation rulings are recorded</w:t>
             </w:r>
           </w:p>
         </w:tc>
         <w:tc>
           <w:tcPr>
-            <w:tcW w:type="dxa" w:w="1854"/>
-            <w:shd w:fill="EAF1F3"/>
+            <w:tcW w:type="dxa" w:w="2160"/>
           </w:tcPr>
           <w:p>
             <w:r>
-              <w:rPr>
-                <w:rFonts w:ascii="Aptos" w:hAnsi="Aptos"/>
-                <w:sz w:val="16"/>
-              </w:rPr>
-              <w:t>T-001, T-002</w:t>
+              <w:t>[`T-001`](Batches/THREADS.md#t-001), [`T-002`](Batches/THREADS.md#t-002)</w:t>
             </w:r>
           </w:p>
         </w:tc>
       </w:tr>
       <w:tr>
-        <w:trPr>
-          <w:cantSplit/>
-        </w:trPr>
         <w:tc>
           <w:tcPr>
-            <w:tcW w:type="dxa" w:w="1139"/>
+            <w:tcW w:type="dxa" w:w="2160"/>
           </w:tcPr>
           <w:p>
             <w:r>
-              <w:rPr>
-                <w:rFonts w:ascii="Aptos" w:hAnsi="Aptos"/>
-                <w:sz w:val="16"/>
-              </w:rPr>
-              <w:t>A17</w:t>
+              <w:t>[A17](Batches/A17-2026-09-11-the-pathogen-and-the-branching-graph-are-integrated.md)</w:t>
             </w:r>
           </w:p>
         </w:tc>
         <w:tc>
           <w:tcPr>
-            <w:tcW w:type="dxa" w:w="1624"/>
+            <w:tcW w:type="dxa" w:w="2160"/>
           </w:tcPr>
           <w:p>
             <w:r>
-              <w:rPr>
-                <w:rFonts w:ascii="Aptos" w:hAnsi="Aptos"/>
-                <w:sz w:val="16"/>
-              </w:rPr>
               <w:t>2026-09-11</w:t>
             </w:r>
           </w:p>
         </w:tc>
         <w:tc>
           <w:tcPr>
-            <w:tcW w:type="dxa" w:w="5548"/>
+            <w:tcW w:type="dxa" w:w="2160"/>
           </w:tcPr>
           <w:p>
             <w:r>
-              <w:rPr>
-                <w:rFonts w:ascii="Aptos" w:hAnsi="Aptos"/>
-                <w:sz w:val="16"/>
-              </w:rPr>
               <w:t>The pathogen and the branching graph are integrated</w:t>
             </w:r>
           </w:p>
         </w:tc>
         <w:tc>
           <w:tcPr>
-            <w:tcW w:type="dxa" w:w="1854"/>
+            <w:tcW w:type="dxa" w:w="2160"/>
           </w:tcPr>
           <w:p>
             <w:r>
-              <w:rPr>
-                <w:rFonts w:ascii="Aptos" w:hAnsi="Aptos"/>
-                <w:sz w:val="16"/>
-              </w:rPr>
-              <w:t>T-001, T-002</w:t>
+              <w:t>[`T-001`](Batches/THREADS.md#t-001), [`T-002`](Batches/THREADS.md#t-002)</w:t>
             </w:r>
           </w:p>
         </w:tc>
       </w:tr>
       <w:tr>
-        <w:trPr>
-          <w:cantSplit/>
-        </w:trPr>
         <w:tc>
           <w:tcPr>
-            <w:tcW w:type="dxa" w:w="1139"/>
-            <w:shd w:fill="EAF1F3"/>
+            <w:tcW w:type="dxa" w:w="2160"/>
           </w:tcPr>
           <w:p>
             <w:r>
-              <w:rPr>
-                <w:rFonts w:ascii="Aptos" w:hAnsi="Aptos"/>
-                <w:sz w:val="16"/>
-              </w:rPr>
-              <w:t>A18</w:t>
+              <w:t>[A18](Batches/A18-2026-09-11-the-zao-state-producer.md)</w:t>
             </w:r>
           </w:p>
         </w:tc>
         <w:tc>
           <w:tcPr>
-            <w:tcW w:type="dxa" w:w="1624"/>
-            <w:shd w:fill="EAF1F3"/>
+            <w:tcW w:type="dxa" w:w="2160"/>
           </w:tcPr>
           <w:p>
             <w:r>
-              <w:rPr>
-                <w:rFonts w:ascii="Aptos" w:hAnsi="Aptos"/>
-                <w:sz w:val="16"/>
-              </w:rPr>
               <w:t>2026-09-11</w:t>
             </w:r>
           </w:p>
         </w:tc>
         <w:tc>
           <w:tcPr>
-            <w:tcW w:type="dxa" w:w="5548"/>
-            <w:shd w:fill="EAF1F3"/>
+            <w:tcW w:type="dxa" w:w="2160"/>
           </w:tcPr>
           <w:p>
             <w:r>
-              <w:rPr>
-                <w:rFonts w:ascii="Aptos" w:hAnsi="Aptos"/>
-                <w:sz w:val="16"/>
-              </w:rPr>
               <w:t>The ZAO state producer</w:t>
             </w:r>
           </w:p>
         </w:tc>
         <w:tc>
           <w:tcPr>
-            <w:tcW w:type="dxa" w:w="1854"/>
-            <w:shd w:fill="EAF1F3"/>
+            <w:tcW w:type="dxa" w:w="2160"/>
           </w:tcPr>
           <w:p>
             <w:r>
-              <w:rPr>
-                <w:rFonts w:ascii="Aptos" w:hAnsi="Aptos"/>
-                <w:sz w:val="16"/>
-              </w:rPr>
-              <w:t>T-001, T-002</w:t>
+              <w:t>[`T-001`](Batches/THREADS.md#t-001), [`T-002`](Batches/THREADS.md#t-002)</w:t>
             </w:r>
           </w:p>
         </w:tc>
       </w:tr>
       <w:tr>
-        <w:trPr>
-          <w:cantSplit/>
-        </w:trPr>
         <w:tc>
           <w:tcPr>
-            <w:tcW w:type="dxa" w:w="1139"/>
+            <w:tcW w:type="dxa" w:w="2160"/>
           </w:tcPr>
           <w:p>
             <w:r>
-              <w:rPr>
-                <w:rFonts w:ascii="Aptos" w:hAnsi="Aptos"/>
-                <w:sz w:val="16"/>
-              </w:rPr>
-              <w:t>A19</w:t>
+              <w:t>[A19](Batches/A19-2026-09-11-the-state-surface.md)</w:t>
             </w:r>
           </w:p>
         </w:tc>
         <w:tc>
           <w:tcPr>
-            <w:tcW w:type="dxa" w:w="1624"/>
+            <w:tcW w:type="dxa" w:w="2160"/>
           </w:tcPr>
           <w:p>
             <w:r>
-              <w:rPr>
-                <w:rFonts w:ascii="Aptos" w:hAnsi="Aptos"/>
-                <w:sz w:val="16"/>
-              </w:rPr>
               <w:t>2026-09-11</w:t>
             </w:r>
           </w:p>
         </w:tc>
         <w:tc>
           <w:tcPr>
-            <w:tcW w:type="dxa" w:w="5548"/>
+            <w:tcW w:type="dxa" w:w="2160"/>
           </w:tcPr>
           <w:p>
             <w:r>
-              <w:rPr>
-                <w:rFonts w:ascii="Aptos" w:hAnsi="Aptos"/>
-                <w:sz w:val="16"/>
-              </w:rPr>
               <w:t>The state surface</w:t>
             </w:r>
           </w:p>
         </w:tc>
         <w:tc>
           <w:tcPr>
-            <w:tcW w:type="dxa" w:w="1854"/>
+            <w:tcW w:type="dxa" w:w="2160"/>
           </w:tcPr>
           <w:p>
             <w:r>
-              <w:rPr>
-                <w:rFonts w:ascii="Aptos" w:hAnsi="Aptos"/>
-                <w:sz w:val="16"/>
-              </w:rPr>
-              <w:t>T-001, T-002</w:t>
+              <w:t>[`T-001`](Batches/THREADS.md#t-001), [`T-002`](Batches/THREADS.md#t-002)</w:t>
             </w:r>
           </w:p>
         </w:tc>
       </w:tr>
       <w:tr>
-        <w:trPr>
-          <w:cantSplit/>
-        </w:trPr>
         <w:tc>
           <w:tcPr>
-            <w:tcW w:type="dxa" w:w="1139"/>
-            <w:shd w:fill="EAF1F3"/>
+            <w:tcW w:type="dxa" w:w="2160"/>
           </w:tcPr>
           <w:p>
             <w:r>
-              <w:rPr>
-                <w:rFonts w:ascii="Aptos" w:hAnsi="Aptos"/>
-                <w:sz w:val="16"/>
-              </w:rPr>
-              <w:t>A20</w:t>
+              <w:t>[A20](Batches/A20-2026-09-11-the-form-registry-and-the-pathogen-roll.md)</w:t>
             </w:r>
           </w:p>
         </w:tc>
         <w:tc>
           <w:tcPr>
-            <w:tcW w:type="dxa" w:w="1624"/>
-            <w:shd w:fill="EAF1F3"/>
+            <w:tcW w:type="dxa" w:w="2160"/>
           </w:tcPr>
           <w:p>
             <w:r>
-              <w:rPr>
-                <w:rFonts w:ascii="Aptos" w:hAnsi="Aptos"/>
-                <w:sz w:val="16"/>
-              </w:rPr>
               <w:t>2026-09-11</w:t>
             </w:r>
           </w:p>
         </w:tc>
         <w:tc>
           <w:tcPr>
-            <w:tcW w:type="dxa" w:w="5548"/>
-            <w:shd w:fill="EAF1F3"/>
+            <w:tcW w:type="dxa" w:w="2160"/>
           </w:tcPr>
           <w:p>
             <w:r>
-              <w:rPr>
-                <w:rFonts w:ascii="Aptos" w:hAnsi="Aptos"/>
-                <w:sz w:val="16"/>
-              </w:rPr>
               <w:t>The form registry and the pathogen roll</w:t>
             </w:r>
           </w:p>
         </w:tc>
         <w:tc>
           <w:tcPr>
-            <w:tcW w:type="dxa" w:w="1854"/>
-            <w:shd w:fill="EAF1F3"/>
+            <w:tcW w:type="dxa" w:w="2160"/>
           </w:tcPr>
           <w:p>
             <w:r>
-              <w:rPr>
-                <w:rFonts w:ascii="Aptos" w:hAnsi="Aptos"/>
-                <w:sz w:val="16"/>
-              </w:rPr>
-              <w:t>T-001, T-002</w:t>
+              <w:t>[`T-001`](Batches/THREADS.md#t-001), [`T-002`](Batches/THREADS.md#t-002)</w:t>
             </w:r>
           </w:p>
         </w:tc>
       </w:tr>
       <w:tr>
-        <w:trPr>
-          <w:cantSplit/>
-        </w:trPr>
         <w:tc>
           <w:tcPr>
-            <w:tcW w:type="dxa" w:w="1139"/>
+            <w:tcW w:type="dxa" w:w="2160"/>
           </w:tcPr>
           <w:p>
             <w:r>
-              <w:rPr>
-                <w:rFonts w:ascii="Aptos" w:hAnsi="Aptos"/>
-                <w:sz w:val="16"/>
-              </w:rPr>
-              <w:t>A21</w:t>
+              <w:t>[A21](Batches/A21-2026-09-11-the-development-loadout.md)</w:t>
             </w:r>
           </w:p>
         </w:tc>
         <w:tc>
           <w:tcPr>
-            <w:tcW w:type="dxa" w:w="1624"/>
+            <w:tcW w:type="dxa" w:w="2160"/>
           </w:tcPr>
           <w:p>
             <w:r>
-              <w:rPr>
-                <w:rFonts w:ascii="Aptos" w:hAnsi="Aptos"/>
-                <w:sz w:val="16"/>
-              </w:rPr>
               <w:t>2026-09-11</w:t>
             </w:r>
           </w:p>
         </w:tc>
         <w:tc>
           <w:tcPr>
-            <w:tcW w:type="dxa" w:w="5548"/>
+            <w:tcW w:type="dxa" w:w="2160"/>
           </w:tcPr>
           <w:p>
             <w:r>
-              <w:rPr>
-                <w:rFonts w:ascii="Aptos" w:hAnsi="Aptos"/>
-                <w:sz w:val="16"/>
-              </w:rPr>
               <w:t>The development loadout</w:t>
             </w:r>
           </w:p>
         </w:tc>
         <w:tc>
           <w:tcPr>
-            <w:tcW w:type="dxa" w:w="1854"/>
+            <w:tcW w:type="dxa" w:w="2160"/>
           </w:tcPr>
           <w:p>
             <w:r>
-              <w:rPr>
-                <w:rFonts w:ascii="Aptos" w:hAnsi="Aptos"/>
-                <w:sz w:val="16"/>
-              </w:rPr>
-              <w:t>T-001, T-002</w:t>
+              <w:t>[`T-001`](Batches/THREADS.md#t-001), [`T-002`](Batches/THREADS.md#t-002)</w:t>
             </w:r>
           </w:p>
         </w:tc>
       </w:tr>
       <w:tr>
-        <w:trPr>
-          <w:cantSplit/>
-        </w:trPr>
         <w:tc>
           <w:tcPr>
-            <w:tcW w:type="dxa" w:w="1139"/>
-            <w:shd w:fill="EAF1F3"/>
+            <w:tcW w:type="dxa" w:w="2160"/>
           </w:tcPr>
           <w:p>
             <w:r>
-              <w:rPr>
-                <w:rFonts w:ascii="Aptos" w:hAnsi="Aptos"/>
-                <w:sz w:val="16"/>
-              </w:rPr>
-              <w:t>A22</w:t>
+              <w:t>[A22](Batches/A22-2026-09-11-the-form-overlay.md)</w:t>
             </w:r>
           </w:p>
         </w:tc>
         <w:tc>
           <w:tcPr>
-            <w:tcW w:type="dxa" w:w="1624"/>
-            <w:shd w:fill="EAF1F3"/>
+            <w:tcW w:type="dxa" w:w="2160"/>
           </w:tcPr>
           <w:p>
             <w:r>
-              <w:rPr>
-                <w:rFonts w:ascii="Aptos" w:hAnsi="Aptos"/>
-                <w:sz w:val="16"/>
-              </w:rPr>
               <w:t>2026-09-11</w:t>
             </w:r>
           </w:p>
         </w:tc>
         <w:tc>
           <w:tcPr>
-            <w:tcW w:type="dxa" w:w="5548"/>
-            <w:shd w:fill="EAF1F3"/>
+            <w:tcW w:type="dxa" w:w="2160"/>
           </w:tcPr>
           <w:p>
             <w:r>
-              <w:rPr>
-                <w:rFonts w:ascii="Aptos" w:hAnsi="Aptos"/>
-                <w:sz w:val="16"/>
-              </w:rPr>
               <w:t>The form overlay</w:t>
             </w:r>
           </w:p>
         </w:tc>
         <w:tc>
           <w:tcPr>
-            <w:tcW w:type="dxa" w:w="1854"/>
-            <w:shd w:fill="EAF1F3"/>
+            <w:tcW w:type="dxa" w:w="2160"/>
           </w:tcPr>
           <w:p>
             <w:r>
-              <w:rPr>
-                <w:rFonts w:ascii="Aptos" w:hAnsi="Aptos"/>
-                <w:sz w:val="16"/>
-              </w:rPr>
-              <w:t>T-001, T-002</w:t>
+              <w:t>[`T-001`](Batches/THREADS.md#t-001), [`T-002`](Batches/THREADS.md#t-002)</w:t>
             </w:r>
           </w:p>
         </w:tc>
       </w:tr>
       <w:tr>
-        <w:trPr>
-          <w:cantSplit/>
-        </w:trPr>
         <w:tc>
           <w:tcPr>
-            <w:tcW w:type="dxa" w:w="1139"/>
+            <w:tcW w:type="dxa" w:w="2160"/>
           </w:tcPr>
           <w:p>
             <w:r>
-              <w:rPr>
-                <w:rFonts w:ascii="Aptos" w:hAnsi="Aptos"/>
-                <w:sz w:val="16"/>
-              </w:rPr>
-              <w:t>A23</w:t>
+              <w:t>[A23](Batches/A23-2026-09-11-the-turned-body-is-driven.md)</w:t>
             </w:r>
           </w:p>
         </w:tc>
         <w:tc>
           <w:tcPr>
-            <w:tcW w:type="dxa" w:w="1624"/>
+            <w:tcW w:type="dxa" w:w="2160"/>
           </w:tcPr>
           <w:p>
             <w:r>
-              <w:rPr>
-                <w:rFonts w:ascii="Aptos" w:hAnsi="Aptos"/>
-                <w:sz w:val="16"/>
-              </w:rPr>
               <w:t>2026-09-11</w:t>
             </w:r>
           </w:p>
         </w:tc>
         <w:tc>
           <w:tcPr>
-            <w:tcW w:type="dxa" w:w="5548"/>
+            <w:tcW w:type="dxa" w:w="2160"/>
           </w:tcPr>
           <w:p>
             <w:r>
-              <w:rPr>
-                <w:rFonts w:ascii="Aptos" w:hAnsi="Aptos"/>
-                <w:sz w:val="16"/>
-              </w:rPr>
               <w:t>The turned body is driven</w:t>
             </w:r>
           </w:p>
         </w:tc>
         <w:tc>
           <w:tcPr>
-            <w:tcW w:type="dxa" w:w="1854"/>
+            <w:tcW w:type="dxa" w:w="2160"/>
           </w:tcPr>
           <w:p>
             <w:r>
-              <w:rPr>
-                <w:rFonts w:ascii="Aptos" w:hAnsi="Aptos"/>
-                <w:sz w:val="16"/>
-              </w:rPr>
-              <w:t>T-001, T-002</w:t>
+              <w:t>[`T-001`](Batches/THREADS.md#t-001), [`T-002`](Batches/THREADS.md#t-002)</w:t>
             </w:r>
           </w:p>
         </w:tc>
       </w:tr>
       <w:tr>
-        <w:trPr>
-          <w:cantSplit/>
-        </w:trPr>
         <w:tc>
           <w:tcPr>
-            <w:tcW w:type="dxa" w:w="1139"/>
-            <w:shd w:fill="EAF1F3"/>
+            <w:tcW w:type="dxa" w:w="2160"/>
           </w:tcPr>
           <w:p>
             <w:r>
-              <w:rPr>
-                <w:rFonts w:ascii="Aptos" w:hAnsi="Aptos"/>
-                <w:sz w:val="16"/>
-              </w:rPr>
-              <w:t>A24</w:t>
+              <w:t>[A24](Batches/A24-2026-09-11-the-mod-id-is-chosen.md)</w:t>
             </w:r>
           </w:p>
         </w:tc>
         <w:tc>
           <w:tcPr>
-            <w:tcW w:type="dxa" w:w="1624"/>
-            <w:shd w:fill="EAF1F3"/>
+            <w:tcW w:type="dxa" w:w="2160"/>
           </w:tcPr>
           <w:p>
             <w:r>
-              <w:rPr>
-                <w:rFonts w:ascii="Aptos" w:hAnsi="Aptos"/>
-                <w:sz w:val="16"/>
-              </w:rPr>
               <w:t>2026-09-11</w:t>
             </w:r>
           </w:p>
         </w:tc>
         <w:tc>
           <w:tcPr>
-            <w:tcW w:type="dxa" w:w="5548"/>
-            <w:shd w:fill="EAF1F3"/>
+            <w:tcW w:type="dxa" w:w="2160"/>
           </w:tcPr>
           <w:p>
             <w:r>
-              <w:rPr>
-                <w:rFonts w:ascii="Aptos" w:hAnsi="Aptos"/>
-                <w:sz w:val="16"/>
-              </w:rPr>
               <w:t>The mod id is chosen</w:t>
             </w:r>
           </w:p>
         </w:tc>
         <w:tc>
           <w:tcPr>
-            <w:tcW w:type="dxa" w:w="1854"/>
-            <w:shd w:fill="EAF1F3"/>
+            <w:tcW w:type="dxa" w:w="2160"/>
           </w:tcPr>
           <w:p>
             <w:r>
-              <w:rPr>
-                <w:rFonts w:ascii="Aptos" w:hAnsi="Aptos"/>
-                <w:sz w:val="16"/>
-              </w:rPr>
-              <w:t>T-001, T-002</w:t>
+              <w:t>[`T-001`](Batches/THREADS.md#t-001), [`T-002`](Batches/THREADS.md#t-002)</w:t>
             </w:r>
           </w:p>
         </w:tc>
       </w:tr>
       <w:tr>
-        <w:trPr>
-          <w:cantSplit/>
-        </w:trPr>
         <w:tc>
           <w:tcPr>
-            <w:tcW w:type="dxa" w:w="1139"/>
+            <w:tcW w:type="dxa" w:w="2160"/>
           </w:tcPr>
           <w:p>
             <w:r>
-              <w:rPr>
-                <w:rFonts w:ascii="Aptos" w:hAnsi="Aptos"/>
-                <w:sz w:val="16"/>
-              </w:rPr>
-              <w:t>A25</w:t>
+              <w:t>[A25](Batches/A25-2026-09-11-the-claim-surface-is-published.md)</w:t>
             </w:r>
           </w:p>
         </w:tc>
         <w:tc>
           <w:tcPr>
-            <w:tcW w:type="dxa" w:w="1624"/>
+            <w:tcW w:type="dxa" w:w="2160"/>
           </w:tcPr>
           <w:p>
             <w:r>
-              <w:rPr>
-                <w:rFonts w:ascii="Aptos" w:hAnsi="Aptos"/>
-                <w:sz w:val="16"/>
-              </w:rPr>
               <w:t>2026-09-11</w:t>
             </w:r>
           </w:p>
         </w:tc>
         <w:tc>
           <w:tcPr>
-            <w:tcW w:type="dxa" w:w="5548"/>
+            <w:tcW w:type="dxa" w:w="2160"/>
           </w:tcPr>
           <w:p>
             <w:r>
-              <w:rPr>
-                <w:rFonts w:ascii="Aptos" w:hAnsi="Aptos"/>
-                <w:sz w:val="16"/>
-              </w:rPr>
               <w:t>The claim surface is published</w:t>
             </w:r>
           </w:p>
         </w:tc>
         <w:tc>
           <w:tcPr>
-            <w:tcW w:type="dxa" w:w="1854"/>
+            <w:tcW w:type="dxa" w:w="2160"/>
           </w:tcPr>
           <w:p>
             <w:r>
-              <w:rPr>
-                <w:rFonts w:ascii="Aptos" w:hAnsi="Aptos"/>
-                <w:sz w:val="16"/>
-              </w:rPr>
-              <w:t>T-001, T-002</w:t>
+              <w:t>[`T-001`](Batches/THREADS.md#t-001), [`T-002`](Batches/THREADS.md#t-002)</w:t>
             </w:r>
           </w:p>
         </w:tc>
       </w:tr>
       <w:tr>
-        <w:trPr>
-          <w:cantSplit/>
-        </w:trPr>
         <w:tc>
           <w:tcPr>
-            <w:tcW w:type="dxa" w:w="1139"/>
-            <w:shd w:fill="EAF1F3"/>
+            <w:tcW w:type="dxa" w:w="2160"/>
           </w:tcPr>
           <w:p>
             <w:r>
-              <w:rPr>
-                <w:rFonts w:ascii="Aptos" w:hAnsi="Aptos"/>
-                <w:sz w:val="16"/>
-              </w:rPr>
-              <w:t>A26</w:t>
+              <w:t>[A26](Batches/A26-2026-09-11-the-defaults-are-chosen.md)</w:t>
             </w:r>
           </w:p>
         </w:tc>
         <w:tc>
           <w:tcPr>
-            <w:tcW w:type="dxa" w:w="1624"/>
-            <w:shd w:fill="EAF1F3"/>
+            <w:tcW w:type="dxa" w:w="2160"/>
           </w:tcPr>
           <w:p>
             <w:r>
-              <w:rPr>
-                <w:rFonts w:ascii="Aptos" w:hAnsi="Aptos"/>
-                <w:sz w:val="16"/>
-              </w:rPr>
               <w:t>2026-09-11</w:t>
             </w:r>
           </w:p>
         </w:tc>
         <w:tc>
           <w:tcPr>
-            <w:tcW w:type="dxa" w:w="5548"/>
-            <w:shd w:fill="EAF1F3"/>
+            <w:tcW w:type="dxa" w:w="2160"/>
           </w:tcPr>
           <w:p>
             <w:r>
-              <w:rPr>
-                <w:rFonts w:ascii="Aptos" w:hAnsi="Aptos"/>
-                <w:sz w:val="16"/>
-              </w:rPr>
               <w:t>The defaults are chosen</w:t>
             </w:r>
           </w:p>
         </w:tc>
         <w:tc>
           <w:tcPr>
-            <w:tcW w:type="dxa" w:w="1854"/>
-            <w:shd w:fill="EAF1F3"/>
+            <w:tcW w:type="dxa" w:w="2160"/>
           </w:tcPr>
           <w:p>
             <w:r>
-              <w:rPr>
-                <w:rFonts w:ascii="Aptos" w:hAnsi="Aptos"/>
-                <w:sz w:val="16"/>
-              </w:rPr>
-              <w:t>T-001, T-002</w:t>
+              <w:t>[`T-001`](Batches/THREADS.md#t-001), [`T-002`](Batches/THREADS.md#t-002)</w:t>
             </w:r>
           </w:p>
         </w:tc>
       </w:tr>
       <w:tr>
-        <w:trPr>
-          <w:cantSplit/>
-        </w:trPr>
         <w:tc>
           <w:tcPr>
-            <w:tcW w:type="dxa" w:w="1139"/>
+            <w:tcW w:type="dxa" w:w="2160"/>
           </w:tcPr>
           <w:p>
             <w:r>
-              <w:rPr>
-                <w:rFonts w:ascii="Aptos" w:hAnsi="Aptos"/>
-                <w:sz w:val="16"/>
-              </w:rPr>
-              <w:t>A27</w:t>
+              <w:t>[A27](Batches/A27-2026-09-11-the-controller-check-is-corrected.md)</w:t>
             </w:r>
           </w:p>
         </w:tc>
         <w:tc>
           <w:tcPr>
-            <w:tcW w:type="dxa" w:w="1624"/>
+            <w:tcW w:type="dxa" w:w="2160"/>
           </w:tcPr>
           <w:p>
             <w:r>
-              <w:rPr>
-                <w:rFonts w:ascii="Aptos" w:hAnsi="Aptos"/>
-                <w:sz w:val="16"/>
-              </w:rPr>
               <w:t>2026-09-11</w:t>
             </w:r>
           </w:p>
         </w:tc>
         <w:tc>
           <w:tcPr>
-            <w:tcW w:type="dxa" w:w="5548"/>
+            <w:tcW w:type="dxa" w:w="2160"/>
           </w:tcPr>
           <w:p>
             <w:r>
-              <w:rPr>
-                <w:rFonts w:ascii="Aptos" w:hAnsi="Aptos"/>
-                <w:sz w:val="16"/>
-              </w:rPr>
               <w:t>The controller check is corrected</w:t>
             </w:r>
           </w:p>
         </w:tc>
         <w:tc>
           <w:tcPr>
-            <w:tcW w:type="dxa" w:w="1854"/>
+            <w:tcW w:type="dxa" w:w="2160"/>
           </w:tcPr>
           <w:p>
             <w:r>
-              <w:rPr>
-                <w:rFonts w:ascii="Aptos" w:hAnsi="Aptos"/>
-                <w:sz w:val="16"/>
-              </w:rPr>
-              <w:t>T-001, T-002</w:t>
+              <w:t>[`T-001`](Batches/THREADS.md#t-001), [`T-002`](Batches/THREADS.md#t-002)</w:t>
             </w:r>
           </w:p>
         </w:tc>
       </w:tr>
       <w:tr>
-        <w:trPr>
-          <w:cantSplit/>
-        </w:trPr>
         <w:tc>
           <w:tcPr>
-            <w:tcW w:type="dxa" w:w="1139"/>
-            <w:shd w:fill="EAF1F3"/>
+            <w:tcW w:type="dxa" w:w="2160"/>
           </w:tcPr>
           <w:p>
             <w:r>
-              <w:rPr>
-                <w:rFonts w:ascii="Aptos" w:hAnsi="Aptos"/>
-                <w:sz w:val="16"/>
-              </w:rPr>
-              <w:t>A28</w:t>
+              <w:t>[A28](Batches/A28-2026-09-11-the-java-bridge-is-built.md)</w:t>
             </w:r>
           </w:p>
         </w:tc>
         <w:tc>
           <w:tcPr>
-            <w:tcW w:type="dxa" w:w="1624"/>
-            <w:shd w:fill="EAF1F3"/>
+            <w:tcW w:type="dxa" w:w="2160"/>
           </w:tcPr>
           <w:p>
             <w:r>
-              <w:rPr>
-                <w:rFonts w:ascii="Aptos" w:hAnsi="Aptos"/>
-                <w:sz w:val="16"/>
-              </w:rPr>
               <w:t>2026-09-11</w:t>
             </w:r>
           </w:p>
         </w:tc>
         <w:tc>
           <w:tcPr>
-            <w:tcW w:type="dxa" w:w="5548"/>
-            <w:shd w:fill="EAF1F3"/>
+            <w:tcW w:type="dxa" w:w="2160"/>
           </w:tcPr>
           <w:p>
             <w:r>
-              <w:rPr>
-                <w:rFonts w:ascii="Aptos" w:hAnsi="Aptos"/>
-                <w:sz w:val="16"/>
-              </w:rPr>
               <w:t>The Java bridge is built</w:t>
             </w:r>
           </w:p>
         </w:tc>
         <w:tc>
           <w:tcPr>
-            <w:tcW w:type="dxa" w:w="1854"/>
-            <w:shd w:fill="EAF1F3"/>
+            <w:tcW w:type="dxa" w:w="2160"/>
           </w:tcPr>
           <w:p>
             <w:r>
-              <w:rPr>
-                <w:rFonts w:ascii="Aptos" w:hAnsi="Aptos"/>
-                <w:sz w:val="16"/>
-              </w:rPr>
-              <w:t>T-001, T-002</w:t>
+              <w:t>[`T-001`](Batches/THREADS.md#t-001), [`T-002`](Batches/THREADS.md#t-002)</w:t>
             </w:r>
           </w:p>
         </w:tc>
       </w:tr>
       <w:tr>
-        <w:trPr>
-          <w:cantSplit/>
-        </w:trPr>
         <w:tc>
           <w:tcPr>
-            <w:tcW w:type="dxa" w:w="1139"/>
+            <w:tcW w:type="dxa" w:w="2160"/>
           </w:tcPr>
           <w:p>
             <w:r>
-              <w:rPr>
-                <w:rFonts w:ascii="Aptos" w:hAnsi="Aptos"/>
-                <w:sz w:val="16"/>
-              </w:rPr>
-              <w:t>A29</w:t>
+              <w:t>[A29](Batches/A29-2026-09-12-the-runtime-passes-its-own-dials.md)</w:t>
             </w:r>
           </w:p>
         </w:tc>
         <w:tc>
           <w:tcPr>
-            <w:tcW w:type="dxa" w:w="1624"/>
+            <w:tcW w:type="dxa" w:w="2160"/>
           </w:tcPr>
           <w:p>
             <w:r>
-              <w:rPr>
-                <w:rFonts w:ascii="Aptos" w:hAnsi="Aptos"/>
-                <w:sz w:val="16"/>
-              </w:rPr>
               <w:t>2026-09-12</w:t>
             </w:r>
           </w:p>
         </w:tc>
         <w:tc>
           <w:tcPr>
-            <w:tcW w:type="dxa" w:w="5548"/>
+            <w:tcW w:type="dxa" w:w="2160"/>
           </w:tcPr>
           <w:p>
             <w:r>
-              <w:rPr>
-                <w:rFonts w:ascii="Aptos" w:hAnsi="Aptos"/>
-                <w:sz w:val="16"/>
-              </w:rPr>
               <w:t>The runtime passes its own dials</w:t>
             </w:r>
           </w:p>
         </w:tc>
         <w:tc>
           <w:tcPr>
-            <w:tcW w:type="dxa" w:w="1854"/>
+            <w:tcW w:type="dxa" w:w="2160"/>
           </w:tcPr>
           <w:p>
             <w:r>
-              <w:rPr>
-                <w:rFonts w:ascii="Aptos" w:hAnsi="Aptos"/>
-                <w:sz w:val="16"/>
-              </w:rPr>
-              <w:t>T-001, T-002</w:t>
+              <w:t>[`T-001`](Batches/THREADS.md#t-001), [`T-002`](Batches/THREADS.md#t-002)</w:t>
             </w:r>
           </w:p>
         </w:tc>
       </w:tr>
       <w:tr>
-        <w:trPr>
-          <w:cantSplit/>
-        </w:trPr>
         <w:tc>
           <w:tcPr>
-            <w:tcW w:type="dxa" w:w="1139"/>
-            <w:shd w:fill="EAF1F3"/>
+            <w:tcW w:type="dxa" w:w="2160"/>
           </w:tcPr>
           <w:p>
             <w:r>
-              <w:rPr>
-                <w:rFonts w:ascii="Aptos" w:hAnsi="Aptos"/>
-                <w:sz w:val="16"/>
-              </w:rPr>
-              <w:t>A30</w:t>
+              <w:t>[A30](Batches/A30-2026-09-12-the-sandbox-prefix-is-the-engines-lookup-never-the-title.md)</w:t>
             </w:r>
           </w:p>
         </w:tc>
         <w:tc>
           <w:tcPr>
-            <w:tcW w:type="dxa" w:w="1624"/>
-            <w:shd w:fill="EAF1F3"/>
+            <w:tcW w:type="dxa" w:w="2160"/>
           </w:tcPr>
           <w:p>
             <w:r>
-              <w:rPr>
-                <w:rFonts w:ascii="Aptos" w:hAnsi="Aptos"/>
-                <w:sz w:val="16"/>
-              </w:rPr>
               <w:t>2026-09-12</w:t>
             </w:r>
           </w:p>
         </w:tc>
         <w:tc>
           <w:tcPr>
-            <w:tcW w:type="dxa" w:w="5548"/>
-            <w:shd w:fill="EAF1F3"/>
+            <w:tcW w:type="dxa" w:w="2160"/>
           </w:tcPr>
           <w:p>
             <w:r>
-              <w:rPr>
-                <w:rFonts w:ascii="Aptos" w:hAnsi="Aptos"/>
-                <w:sz w:val="16"/>
-              </w:rPr>
               <w:t>The Sandbox prefix is the engine's lookup, never the title</w:t>
             </w:r>
           </w:p>
         </w:tc>
         <w:tc>
           <w:tcPr>
-            <w:tcW w:type="dxa" w:w="1854"/>
-            <w:shd w:fill="EAF1F3"/>
+            <w:tcW w:type="dxa" w:w="2160"/>
           </w:tcPr>
           <w:p>
             <w:r>
-              <w:rPr>
-                <w:rFonts w:ascii="Aptos" w:hAnsi="Aptos"/>
-                <w:sz w:val="16"/>
-              </w:rPr>
-              <w:t>T-002</w:t>
+              <w:t>[`T-002`](Batches/THREADS.md#t-002)</w:t>
             </w:r>
           </w:p>
         </w:tc>
       </w:tr>
       <w:tr>
-        <w:trPr>
-          <w:cantSplit/>
-        </w:trPr>
         <w:tc>
           <w:tcPr>
-            <w:tcW w:type="dxa" w:w="1139"/>
+            <w:tcW w:type="dxa" w:w="2160"/>
           </w:tcPr>
           <w:p>
             <w:r>
-              <w:rPr>
-                <w:rFonts w:ascii="Aptos" w:hAnsi="Aptos"/>
-                <w:sz w:val="16"/>
-              </w:rPr>
-              <w:t>A31</w:t>
+              <w:t>[A31](Batches/A31-2026-09-13-a-rebuild-of-the-same-source-is-the-same-jar.md)</w:t>
             </w:r>
           </w:p>
         </w:tc>
         <w:tc>
           <w:tcPr>
-            <w:tcW w:type="dxa" w:w="1624"/>
+            <w:tcW w:type="dxa" w:w="2160"/>
           </w:tcPr>
           <w:p>
             <w:r>
-              <w:rPr>
-                <w:rFonts w:ascii="Aptos" w:hAnsi="Aptos"/>
-                <w:sz w:val="16"/>
-              </w:rPr>
               <w:t>2026-09-13</w:t>
             </w:r>
           </w:p>
         </w:tc>
         <w:tc>
           <w:tcPr>
-            <w:tcW w:type="dxa" w:w="5548"/>
+            <w:tcW w:type="dxa" w:w="2160"/>
           </w:tcPr>
           <w:p>
             <w:r>
-              <w:rPr>
-                <w:rFonts w:ascii="Aptos" w:hAnsi="Aptos"/>
-                <w:sz w:val="16"/>
-              </w:rPr>
               <w:t>A rebuild of the same source is the same jar</w:t>
             </w:r>
           </w:p>
         </w:tc>
         <w:tc>
           <w:tcPr>
-            <w:tcW w:type="dxa" w:w="1854"/>
+            <w:tcW w:type="dxa" w:w="2160"/>
           </w:tcPr>
           <w:p>
             <w:r>
-              <w:rPr>
-                <w:rFonts w:ascii="Aptos" w:hAnsi="Aptos"/>
-                <w:sz w:val="16"/>
-              </w:rPr>
-              <w:t>T-001</w:t>
+              <w:t>[`T-001`](Batches/THREADS.md#t-001)</w:t>
             </w:r>
           </w:p>
         </w:tc>
       </w:tr>
       <w:tr>
-        <w:trPr>
-          <w:cantSplit/>
-        </w:trPr>
         <w:tc>
           <w:tcPr>
-            <w:tcW w:type="dxa" w:w="1139"/>
-            <w:shd w:fill="EAF1F3"/>
+            <w:tcW w:type="dxa" w:w="2160"/>
           </w:tcPr>
           <w:p>
             <w:r>
-              <w:rPr>
-                <w:rFonts w:ascii="Aptos" w:hAnsi="Aptos"/>
-                <w:sz w:val="16"/>
-              </w:rPr>
-              <w:t>A32</w:t>
+              <w:t>[A32](Batches/A32-2026-09-13-the-crossed-are-executed.md)</w:t>
             </w:r>
           </w:p>
         </w:tc>
         <w:tc>
           <w:tcPr>
-            <w:tcW w:type="dxa" w:w="1624"/>
-            <w:shd w:fill="EAF1F3"/>
+            <w:tcW w:type="dxa" w:w="2160"/>
           </w:tcPr>
           <w:p>
             <w:r>
-              <w:rPr>
-                <w:rFonts w:ascii="Aptos" w:hAnsi="Aptos"/>
-                <w:sz w:val="16"/>
-              </w:rPr>
               <w:t>2026-09-13</w:t>
             </w:r>
           </w:p>
         </w:tc>
         <w:tc>
           <w:tcPr>
-            <w:tcW w:type="dxa" w:w="5548"/>
-            <w:shd w:fill="EAF1F3"/>
+            <w:tcW w:type="dxa" w:w="2160"/>
           </w:tcPr>
           <w:p>
             <w:r>
-              <w:rPr>
-                <w:rFonts w:ascii="Aptos" w:hAnsi="Aptos"/>
-                <w:sz w:val="16"/>
-              </w:rPr>
               <w:t>The crossed are executed</w:t>
             </w:r>
           </w:p>
         </w:tc>
         <w:tc>
           <w:tcPr>
-            <w:tcW w:type="dxa" w:w="1854"/>
-            <w:shd w:fill="EAF1F3"/>
+            <w:tcW w:type="dxa" w:w="2160"/>
           </w:tcPr>
           <w:p>
             <w:r>
-              <w:rPr>
-                <w:rFonts w:ascii="Aptos" w:hAnsi="Aptos"/>
-                <w:sz w:val="16"/>
-              </w:rPr>
-              <w:t>T-001, T-002</w:t>
+              <w:t>[`T-001`](Batches/THREADS.md#t-001), [`T-002`](Batches/THREADS.md#t-002)</w:t>
             </w:r>
           </w:p>
         </w:tc>
       </w:tr>
       <w:tr>
-        <w:trPr>
-          <w:cantSplit/>
-        </w:trPr>
         <w:tc>
           <w:tcPr>
-            <w:tcW w:type="dxa" w:w="1139"/>
+            <w:tcW w:type="dxa" w:w="2160"/>
           </w:tcPr>
           <w:p>
             <w:r>
-              <w:rPr>
-                <w:rFonts w:ascii="Aptos" w:hAnsi="Aptos"/>
-                <w:sz w:val="16"/>
-              </w:rPr>
-              <w:t>A33</w:t>
+              <w:t>[A33](Batches/A33-2026-09-13-the-corpse-is-laid-down.md)</w:t>
             </w:r>
           </w:p>
         </w:tc>
         <w:tc>
           <w:tcPr>
-            <w:tcW w:type="dxa" w:w="1624"/>
+            <w:tcW w:type="dxa" w:w="2160"/>
           </w:tcPr>
           <w:p>
             <w:r>
-              <w:rPr>
-                <w:rFonts w:ascii="Aptos" w:hAnsi="Aptos"/>
-                <w:sz w:val="16"/>
-              </w:rPr>
               <w:t>2026-09-13</w:t>
             </w:r>
           </w:p>
         </w:tc>
         <w:tc>
           <w:tcPr>
-            <w:tcW w:type="dxa" w:w="5548"/>
+            <w:tcW w:type="dxa" w:w="2160"/>
           </w:tcPr>
           <w:p>
             <w:r>
-              <w:rPr>
-                <w:rFonts w:ascii="Aptos" w:hAnsi="Aptos"/>
-                <w:sz w:val="16"/>
-              </w:rPr>
               <w:t>The corpse is laid down</w:t>
             </w:r>
           </w:p>
         </w:tc>
         <w:tc>
           <w:tcPr>
-            <w:tcW w:type="dxa" w:w="1854"/>
+            <w:tcW w:type="dxa" w:w="2160"/>
           </w:tcPr>
           <w:p>
             <w:r>
-              <w:rPr>
-                <w:rFonts w:ascii="Aptos" w:hAnsi="Aptos"/>
-                <w:sz w:val="16"/>
-              </w:rPr>
-              <w:t>T-001, T-002</w:t>
+              <w:t>[`T-001`](Batches/THREADS.md#t-001), [`T-002`](Batches/THREADS.md#t-002)</w:t>
             </w:r>
           </w:p>
         </w:tc>
       </w:tr>
       <w:tr>
-        <w:trPr>
-          <w:cantSplit/>
-        </w:trPr>
         <w:tc>
           <w:tcPr>
-            <w:tcW w:type="dxa" w:w="1139"/>
-            <w:shd w:fill="EAF1F3"/>
+            <w:tcW w:type="dxa" w:w="2160"/>
           </w:tcPr>
           <w:p>
             <w:r>
-              <w:rPr>
-                <w:rFonts w:ascii="Aptos" w:hAnsi="Aptos"/>
-                <w:sz w:val="16"/>
-              </w:rPr>
-              <w:t>A34</w:t>
+              <w:t>[A34](Batches/A34-2026-09-18-pathogen-vm-compatibility.md)</w:t>
             </w:r>
           </w:p>
         </w:tc>
         <w:tc>
           <w:tcPr>
-            <w:tcW w:type="dxa" w:w="1624"/>
-            <w:shd w:fill="EAF1F3"/>
+            <w:tcW w:type="dxa" w:w="2160"/>
           </w:tcPr>
           <w:p>
             <w:r>
-              <w:rPr>
-                <w:rFonts w:ascii="Aptos" w:hAnsi="Aptos"/>
-                <w:sz w:val="16"/>
-              </w:rPr>
               <w:t>2026-09-18</w:t>
             </w:r>
           </w:p>
         </w:tc>
         <w:tc>
           <w:tcPr>
-            <w:tcW w:type="dxa" w:w="5548"/>
-            <w:shd w:fill="EAF1F3"/>
+            <w:tcW w:type="dxa" w:w="2160"/>
           </w:tcPr>
           <w:p>
             <w:r>
-              <w:rPr>
-                <w:rFonts w:ascii="Aptos" w:hAnsi="Aptos"/>
-                <w:sz w:val="16"/>
-              </w:rPr>
               <w:t>Pathogen VM compatibility</w:t>
             </w:r>
           </w:p>
         </w:tc>
         <w:tc>
           <w:tcPr>
-            <w:tcW w:type="dxa" w:w="1854"/>
-            <w:shd w:fill="EAF1F3"/>
+            <w:tcW w:type="dxa" w:w="2160"/>
           </w:tcPr>
           <w:p>
             <w:r>
-              <w:rPr>
-                <w:rFonts w:ascii="Aptos" w:hAnsi="Aptos"/>
-                <w:sz w:val="16"/>
-              </w:rPr>
-              <w:t>T-001, T-002</w:t>
+              <w:t>[`T-001`](Batches/THREADS.md#t-001), [`T-002`](Batches/THREADS.md#t-002)</w:t>
             </w:r>
           </w:p>
         </w:tc>
       </w:tr>
       <w:tr>
-        <w:trPr>
-          <w:cantSplit/>
-        </w:trPr>
         <w:tc>
           <w:tcPr>
-            <w:tcW w:type="dxa" w:w="1139"/>
+            <w:tcW w:type="dxa" w:w="2160"/>
           </w:tcPr>
           <w:p>
             <w:r>
-              <w:rPr>
-                <w:rFonts w:ascii="Aptos" w:hAnsi="Aptos"/>
-                <w:sz w:val="16"/>
-              </w:rPr>
-              <w:t>A35</w:t>
+              <w:t>[A35](Batches/A35-2026-09-19-authorized-afflicted-return.md)</w:t>
             </w:r>
           </w:p>
         </w:tc>
         <w:tc>
           <w:tcPr>
-            <w:tcW w:type="dxa" w:w="1624"/>
+            <w:tcW w:type="dxa" w:w="2160"/>
           </w:tcPr>
           <w:p>
             <w:r>
-              <w:rPr>
-                <w:rFonts w:ascii="Aptos" w:hAnsi="Aptos"/>
-                <w:sz w:val="16"/>
-              </w:rPr>
               <w:t>2026-09-19</w:t>
             </w:r>
           </w:p>
         </w:tc>
         <w:tc>
           <w:tcPr>
-            <w:tcW w:type="dxa" w:w="5548"/>
+            <w:tcW w:type="dxa" w:w="2160"/>
           </w:tcPr>
           <w:p>
             <w:r>
-              <w:rPr>
-                <w:rFonts w:ascii="Aptos" w:hAnsi="Aptos"/>
-                <w:sz w:val="16"/>
-              </w:rPr>
               <w:t>Authorized afflicted return</w:t>
             </w:r>
           </w:p>
         </w:tc>
         <w:tc>
           <w:tcPr>
-            <w:tcW w:type="dxa" w:w="1854"/>
+            <w:tcW w:type="dxa" w:w="2160"/>
           </w:tcPr>
           <w:p>
             <w:r>
-              <w:rPr>
-                <w:rFonts w:ascii="Aptos" w:hAnsi="Aptos"/>
-                <w:sz w:val="16"/>
-              </w:rPr>
-              <w:t>T-001, T-002</w:t>
+              <w:t>[`T-001`](Batches/THREADS.md#t-001), [`T-002`](Batches/THREADS.md#t-002)</w:t>
             </w:r>
           </w:p>
         </w:tc>
       </w:tr>
       <w:tr>
-        <w:trPr>
-          <w:cantSplit/>
-        </w:trPr>
         <w:tc>
           <w:tcPr>
-            <w:tcW w:type="dxa" w:w="1139"/>
-            <w:shd w:fill="EAF1F3"/>
+            <w:tcW w:type="dxa" w:w="2160"/>
           </w:tcPr>
           <w:p>
             <w:r>
-              <w:rPr>
-                <w:rFonts w:ascii="Aptos" w:hAnsi="Aptos"/>
-                <w:sz w:val="16"/>
-              </w:rPr>
-              <w:t>A36</w:t>
+              <w:t>[A36](Batches/A36-2026-09-19-durable-runtime-reconstruction.md)</w:t>
             </w:r>
           </w:p>
         </w:tc>
         <w:tc>
           <w:tcPr>
-            <w:tcW w:type="dxa" w:w="1624"/>
-            <w:shd w:fill="EAF1F3"/>
+            <w:tcW w:type="dxa" w:w="2160"/>
           </w:tcPr>
           <w:p>
             <w:r>
-              <w:rPr>
-                <w:rFonts w:ascii="Aptos" w:hAnsi="Aptos"/>
-                <w:sz w:val="16"/>
-              </w:rPr>
               <w:t>2026-09-19</w:t>
             </w:r>
           </w:p>
         </w:tc>
         <w:tc>
           <w:tcPr>
-            <w:tcW w:type="dxa" w:w="5548"/>
-            <w:shd w:fill="EAF1F3"/>
+            <w:tcW w:type="dxa" w:w="2160"/>
           </w:tcPr>
           <w:p>
             <w:r>
-              <w:rPr>
-                <w:rFonts w:ascii="Aptos" w:hAnsi="Aptos"/>
-                <w:sz w:val="16"/>
-              </w:rPr>
               <w:t>Durable/runtime reconstruction</w:t>
             </w:r>
           </w:p>
         </w:tc>
         <w:tc>
           <w:tcPr>
-            <w:tcW w:type="dxa" w:w="1854"/>
-            <w:shd w:fill="EAF1F3"/>
+            <w:tcW w:type="dxa" w:w="2160"/>
           </w:tcPr>
           <w:p>
             <w:r>
-              <w:rPr>
-                <w:rFonts w:ascii="Aptos" w:hAnsi="Aptos"/>
-                <w:sz w:val="16"/>
-              </w:rPr>
-              <w:t>T-001, T-002</w:t>
+              <w:t>[`T-001`](Batches/THREADS.md#t-001), [`T-002`](Batches/THREADS.md#t-002)</w:t>
             </w:r>
           </w:p>
         </w:tc>
       </w:tr>
       <w:tr>
-        <w:trPr>
-          <w:cantSplit/>
-        </w:trPr>
         <w:tc>
           <w:tcPr>
-            <w:tcW w:type="dxa" w:w="1139"/>
+            <w:tcW w:type="dxa" w:w="2160"/>
           </w:tcPr>
           <w:p>
             <w:r>
-              <w:rPr>
-                <w:rFonts w:ascii="Aptos" w:hAnsi="Aptos"/>
-                <w:sz w:val="16"/>
-              </w:rPr>
-              <w:t>A37</w:t>
+              <w:t>[A37](Batches/A37-2026-09-19-intentional-exposure-and-crossed-ownership.md)</w:t>
             </w:r>
           </w:p>
         </w:tc>
         <w:tc>
           <w:tcPr>
-            <w:tcW w:type="dxa" w:w="1624"/>
+            <w:tcW w:type="dxa" w:w="2160"/>
           </w:tcPr>
           <w:p>
             <w:r>
-              <w:rPr>
-                <w:rFonts w:ascii="Aptos" w:hAnsi="Aptos"/>
-                <w:sz w:val="16"/>
-              </w:rPr>
               <w:t>2026-09-19</w:t>
             </w:r>
           </w:p>
         </w:tc>
         <w:tc>
           <w:tcPr>
-            <w:tcW w:type="dxa" w:w="5548"/>
+            <w:tcW w:type="dxa" w:w="2160"/>
           </w:tcPr>
           <w:p>
             <w:r>
-              <w:rPr>
-                <w:rFonts w:ascii="Aptos" w:hAnsi="Aptos"/>
-                <w:sz w:val="16"/>
-              </w:rPr>
               <w:t>Intentional exposure and Crossed ownership</w:t>
             </w:r>
           </w:p>
         </w:tc>
         <w:tc>
           <w:tcPr>
-            <w:tcW w:type="dxa" w:w="1854"/>
+            <w:tcW w:type="dxa" w:w="2160"/>
           </w:tcPr>
           <w:p>
             <w:r>
-              <w:rPr>
-                <w:rFonts w:ascii="Aptos" w:hAnsi="Aptos"/>
-                <w:sz w:val="16"/>
-              </w:rPr>
-              <w:t>T-001, T-002</w:t>
+              <w:t>[`T-001`](Batches/THREADS.md#t-001), [`T-002`](Batches/THREADS.md#t-002)</w:t>
             </w:r>
           </w:p>
         </w:tc>
       </w:tr>
       <w:tr>
-        <w:trPr>
-          <w:cantSplit/>
-        </w:trPr>
         <w:tc>
           <w:tcPr>
-            <w:tcW w:type="dxa" w:w="1139"/>
-            <w:shd w:fill="EAF1F3"/>
+            <w:tcW w:type="dxa" w:w="2160"/>
           </w:tcPr>
           <w:p>
             <w:r>
-              <w:rPr>
-                <w:rFonts w:ascii="Aptos" w:hAnsi="Aptos"/>
-                <w:sz w:val="16"/>
-              </w:rPr>
-              <w:t>A38</w:t>
+              <w:t>[A38](Batches/A38-2026-09-24-crossed-coordination-ownership.md)</w:t>
             </w:r>
           </w:p>
         </w:tc>
         <w:tc>
           <w:tcPr>
-            <w:tcW w:type="dxa" w:w="1624"/>
-            <w:shd w:fill="EAF1F3"/>
+            <w:tcW w:type="dxa" w:w="2160"/>
           </w:tcPr>
           <w:p>
             <w:r>
-              <w:rPr>
-                <w:rFonts w:ascii="Aptos" w:hAnsi="Aptos"/>
-                <w:sz w:val="16"/>
-              </w:rPr>
               <w:t>2026-09-24</w:t>
             </w:r>
           </w:p>
         </w:tc>
         <w:tc>
           <w:tcPr>
-            <w:tcW w:type="dxa" w:w="5548"/>
-            <w:shd w:fill="EAF1F3"/>
+            <w:tcW w:type="dxa" w:w="2160"/>
           </w:tcPr>
           <w:p>
             <w:r>
-              <w:rPr>
-                <w:rFonts w:ascii="Aptos" w:hAnsi="Aptos"/>
-                <w:sz w:val="16"/>
-              </w:rPr>
               <w:t>Crossed coordination ownership</w:t>
             </w:r>
           </w:p>
         </w:tc>
         <w:tc>
           <w:tcPr>
-            <w:tcW w:type="dxa" w:w="1854"/>
-            <w:shd w:fill="EAF1F3"/>
+            <w:tcW w:type="dxa" w:w="2160"/>
           </w:tcPr>
           <w:p>
             <w:r>
-              <w:rPr>
-                <w:rFonts w:ascii="Aptos" w:hAnsi="Aptos"/>
-                <w:sz w:val="16"/>
-              </w:rPr>
-              <w:t>T-001, T-002</w:t>
+              <w:t>[`T-001`](Batches/THREADS.md#t-001), [`T-002`](Batches/THREADS.md#t-002)</w:t>
             </w:r>
           </w:p>
         </w:tc>
       </w:tr>
       <w:tr>
-        <w:trPr>
-          <w:cantSplit/>
-        </w:trPr>
         <w:tc>
           <w:tcPr>
-            <w:tcW w:type="dxa" w:w="1139"/>
+            <w:tcW w:type="dxa" w:w="2160"/>
           </w:tcPr>
           <w:p>
             <w:r>
-              <w:rPr>
-                <w:rFonts w:ascii="Aptos" w:hAnsi="Aptos"/>
-                <w:sz w:val="16"/>
-              </w:rPr>
-              <w:t>A39</w:t>
+              <w:t>[A39](Batches/A39-20260924-2016Z-1316PST-afflicted-and-crossed-execution.md)</w:t>
             </w:r>
           </w:p>
         </w:tc>
         <w:tc>
           <w:tcPr>
-            <w:tcW w:type="dxa" w:w="1624"/>
+            <w:tcW w:type="dxa" w:w="2160"/>
           </w:tcPr>
           <w:p>
             <w:r>
-              <w:rPr>
-                <w:rFonts w:ascii="Aptos" w:hAnsi="Aptos"/>
-                <w:sz w:val="16"/>
-              </w:rPr>
               <w:t>2026-09-24</w:t>
             </w:r>
           </w:p>
         </w:tc>
         <w:tc>
           <w:tcPr>
-            <w:tcW w:type="dxa" w:w="5548"/>
+            <w:tcW w:type="dxa" w:w="2160"/>
           </w:tcPr>
           <w:p>
             <w:r>
-              <w:rPr>
-                <w:rFonts w:ascii="Aptos" w:hAnsi="Aptos"/>
-                <w:sz w:val="16"/>
-              </w:rPr>
               <w:t>Afflicted and Crossed execution</w:t>
             </w:r>
           </w:p>
         </w:tc>
         <w:tc>
           <w:tcPr>
-            <w:tcW w:type="dxa" w:w="1854"/>
+            <w:tcW w:type="dxa" w:w="2160"/>
           </w:tcPr>
           <w:p>
             <w:r>
-              <w:rPr>
-                <w:rFonts w:ascii="Aptos" w:hAnsi="Aptos"/>
-                <w:sz w:val="16"/>
-              </w:rPr>
-              <w:t>T-001, T-002</w:t>
+              <w:t>[`T-001`](Batches/THREADS.md#t-001), [`T-002`](Batches/THREADS.md#t-002)</w:t>
             </w:r>
           </w:p>
         </w:tc>
       </w:tr>
       <w:tr>
-        <w:trPr>
-          <w:cantSplit/>
-        </w:trPr>
         <w:tc>
           <w:tcPr>
-            <w:tcW w:type="dxa" w:w="1139"/>
-            <w:shd w:fill="EAF1F3"/>
+            <w:tcW w:type="dxa" w:w="2160"/>
           </w:tcPr>
           <w:p>
             <w:r>
-              <w:rPr>
-                <w:rFonts w:ascii="Aptos" w:hAnsi="Aptos"/>
-                <w:sz w:val="16"/>
-              </w:rPr>
-              <w:t>A40</w:t>
+              <w:t>[A40](Batches/A40-20260925-0855Z-0155PST-distinct-life-coordination.md)</w:t>
             </w:r>
           </w:p>
         </w:tc>
         <w:tc>
           <w:tcPr>
-            <w:tcW w:type="dxa" w:w="1624"/>
-            <w:shd w:fill="EAF1F3"/>
+            <w:tcW w:type="dxa" w:w="2160"/>
           </w:tcPr>
           <w:p>
             <w:r>
-              <w:rPr>
-                <w:rFonts w:ascii="Aptos" w:hAnsi="Aptos"/>
-                <w:sz w:val="16"/>
-              </w:rPr>
               <w:t>2026-09-25</w:t>
             </w:r>
           </w:p>
         </w:tc>
         <w:tc>
           <w:tcPr>
-            <w:tcW w:type="dxa" w:w="5548"/>
-            <w:shd w:fill="EAF1F3"/>
+            <w:tcW w:type="dxa" w:w="2160"/>
           </w:tcPr>
           <w:p>
             <w:r>
-              <w:rPr>
-                <w:rFonts w:ascii="Aptos" w:hAnsi="Aptos"/>
-                <w:sz w:val="16"/>
-              </w:rPr>
               <w:t>Distinct life coordination</w:t>
             </w:r>
           </w:p>
         </w:tc>
         <w:tc>
           <w:tcPr>
-            <w:tcW w:type="dxa" w:w="1854"/>
-            <w:shd w:fill="EAF1F3"/>
+            <w:tcW w:type="dxa" w:w="2160"/>
           </w:tcPr>
           <w:p>
             <w:r>
-              <w:rPr>
-                <w:rFonts w:ascii="Aptos" w:hAnsi="Aptos"/>
-                <w:sz w:val="16"/>
-              </w:rPr>
-              <w:t>T-001, T-002</w:t>
+              <w:t>[`T-001`](Batches/THREADS.md#t-001), [`T-002`](Batches/THREADS.md#t-002)</w:t>
             </w:r>
           </w:p>
         </w:tc>
       </w:tr>
       <w:tr>
-        <w:trPr>
-          <w:cantSplit/>
-        </w:trPr>
         <w:tc>
           <w:tcPr>
-            <w:tcW w:type="dxa" w:w="1139"/>
+            <w:tcW w:type="dxa" w:w="2160"/>
           </w:tcPr>
           <w:p>
             <w:r>
-              <w:rPr>
-                <w:rFonts w:ascii="Aptos" w:hAnsi="Aptos"/>
-                <w:sz w:val="16"/>
-              </w:rPr>
-              <w:t>A41</w:t>
+              <w:t>[A41](Batches/A41-20260925-1201Z-0501PST-shared-living-execution-owner.md)</w:t>
             </w:r>
           </w:p>
         </w:tc>
         <w:tc>
           <w:tcPr>
-            <w:tcW w:type="dxa" w:w="1624"/>
+            <w:tcW w:type="dxa" w:w="2160"/>
           </w:tcPr>
           <w:p>
             <w:r>
-              <w:rPr>
-                <w:rFonts w:ascii="Aptos" w:hAnsi="Aptos"/>
-                <w:sz w:val="16"/>
-              </w:rPr>
               <w:t>2026-09-25</w:t>
             </w:r>
           </w:p>
         </w:tc>
         <w:tc>
           <w:tcPr>
-            <w:tcW w:type="dxa" w:w="5548"/>
+            <w:tcW w:type="dxa" w:w="2160"/>
           </w:tcPr>
           <w:p>
             <w:r>
-              <w:rPr>
-                <w:rFonts w:ascii="Aptos" w:hAnsi="Aptos"/>
-                <w:sz w:val="16"/>
-              </w:rPr>
               <w:t>Shared living execution owner</w:t>
             </w:r>
           </w:p>
         </w:tc>
         <w:tc>
           <w:tcPr>
-            <w:tcW w:type="dxa" w:w="1854"/>
+            <w:tcW w:type="dxa" w:w="2160"/>
           </w:tcPr>
           <w:p>
             <w:r>
-              <w:rPr>
-                <w:rFonts w:ascii="Aptos" w:hAnsi="Aptos"/>
-                <w:sz w:val="16"/>
-              </w:rPr>
-              <w:t>T-001, T-002</w:t>
+              <w:t>[`T-001`](Batches/THREADS.md#t-001), [`T-002`](Batches/THREADS.md#t-002)</w:t>
             </w:r>
           </w:p>
         </w:tc>
       </w:tr>
       <w:tr>
-        <w:trPr>
-          <w:cantSplit/>
-        </w:trPr>
         <w:tc>
           <w:tcPr>
-            <w:tcW w:type="dxa" w:w="1139"/>
-            <w:shd w:fill="EAF1F3"/>
+            <w:tcW w:type="dxa" w:w="2160"/>
           </w:tcPr>
           <w:p>
             <w:r>
-              <w:rPr>
-                <w:rFonts w:ascii="Aptos" w:hAnsi="Aptos"/>
-                <w:sz w:val="16"/>
-              </w:rPr>
-              <w:t>A42</w:t>
+              <w:t>[A42](Batches/A42-20260925-2145Z-1445PST-private-contact-and-crossed-maintenance-correction.md)</w:t>
             </w:r>
           </w:p>
         </w:tc>
         <w:tc>
           <w:tcPr>
-            <w:tcW w:type="dxa" w:w="1624"/>
-            <w:shd w:fill="EAF1F3"/>
+            <w:tcW w:type="dxa" w:w="2160"/>
           </w:tcPr>
           <w:p>
             <w:r>
-              <w:rPr>
-                <w:rFonts w:ascii="Aptos" w:hAnsi="Aptos"/>
-                <w:sz w:val="16"/>
-              </w:rPr>
               <w:t>2026-09-25</w:t>
             </w:r>
           </w:p>
         </w:tc>
         <w:tc>
           <w:tcPr>
-            <w:tcW w:type="dxa" w:w="5548"/>
-            <w:shd w:fill="EAF1F3"/>
+            <w:tcW w:type="dxa" w:w="2160"/>
           </w:tcPr>
           <w:p>
             <w:r>
-              <w:rPr>
-                <w:rFonts w:ascii="Aptos" w:hAnsi="Aptos"/>
-                <w:sz w:val="16"/>
-              </w:rPr>
               <w:t>Private contact and Crossed maintenance correction</w:t>
             </w:r>
           </w:p>
         </w:tc>
         <w:tc>
           <w:tcPr>
-            <w:tcW w:type="dxa" w:w="1854"/>
-            <w:shd w:fill="EAF1F3"/>
+            <w:tcW w:type="dxa" w:w="2160"/>
           </w:tcPr>
           <w:p>
             <w:r>
-              <w:rPr>
-                <w:rFonts w:ascii="Aptos" w:hAnsi="Aptos"/>
-                <w:sz w:val="16"/>
-              </w:rPr>
-              <w:t>T-001, T-002</w:t>
+              <w:t>[`T-001`](Batches/THREADS.md#t-001), [`T-002`](Batches/THREADS.md#t-002)</w:t>
             </w:r>
           </w:p>
         </w:tc>
       </w:tr>
       <w:tr>
-        <w:trPr>
-          <w:cantSplit/>
-        </w:trPr>
         <w:tc>
           <w:tcPr>
-            <w:tcW w:type="dxa" w:w="1139"/>
+            <w:tcW w:type="dxa" w:w="2160"/>
           </w:tcPr>
           <w:p>
             <w:r>
-              <w:rPr>
-                <w:rFonts w:ascii="Aptos" w:hAnsi="Aptos"/>
-                <w:sz w:val="16"/>
-              </w:rPr>
-              <w:t>A43</w:t>
+              <w:t>[A43](Batches/A43-20260926-0457Z-2157PST-native-facing-and-observer-exclusion.md)</w:t>
             </w:r>
           </w:p>
         </w:tc>
         <w:tc>
           <w:tcPr>
-            <w:tcW w:type="dxa" w:w="1624"/>
+            <w:tcW w:type="dxa" w:w="2160"/>
           </w:tcPr>
           <w:p>
             <w:r>
-              <w:rPr>
-                <w:rFonts w:ascii="Aptos" w:hAnsi="Aptos"/>
-                <w:sz w:val="16"/>
-              </w:rPr>
               <w:t>2026-09-26</w:t>
             </w:r>
           </w:p>
         </w:tc>
         <w:tc>
           <w:tcPr>
-            <w:tcW w:type="dxa" w:w="5548"/>
+            <w:tcW w:type="dxa" w:w="2160"/>
           </w:tcPr>
           <w:p>
             <w:r>
-              <w:rPr>
-                <w:rFonts w:ascii="Aptos" w:hAnsi="Aptos"/>
-                <w:sz w:val="16"/>
-              </w:rPr>
               <w:t>Native facing and observer exclusion</w:t>
             </w:r>
           </w:p>
         </w:tc>
         <w:tc>
           <w:tcPr>
-            <w:tcW w:type="dxa" w:w="1854"/>
+            <w:tcW w:type="dxa" w:w="2160"/>
           </w:tcPr>
           <w:p>
             <w:r>
-              <w:rPr>
-                <w:rFonts w:ascii="Aptos" w:hAnsi="Aptos"/>
-                <w:sz w:val="16"/>
-              </w:rPr>
-              <w:t>T-001, T-002</w:t>
+              <w:t>[`T-001`](Batches/THREADS.md#t-001), [`T-002`](Batches/THREADS.md#t-002)</w:t>
             </w:r>
           </w:p>
         </w:tc>
       </w:tr>
       <w:tr>
-        <w:trPr>
-          <w:cantSplit/>
-        </w:trPr>
         <w:tc>
           <w:tcPr>
-            <w:tcW w:type="dxa" w:w="1139"/>
-            <w:shd w:fill="EAF1F3"/>
+            <w:tcW w:type="dxa" w:w="2160"/>
           </w:tcPr>
           <w:p>
             <w:r>
-              <w:rPr>
-                <w:rFonts w:ascii="Aptos" w:hAnsi="Aptos"/>
-                <w:sz w:val="16"/>
-              </w:rPr>
-              <w:t>A44</w:t>
+              <w:t>[A44](Batches/A44-20260927-0512Z-2212PST-living-orientation-and-elapsed-rollback.md)</w:t>
             </w:r>
           </w:p>
         </w:tc>
         <w:tc>
           <w:tcPr>
-            <w:tcW w:type="dxa" w:w="1624"/>
-            <w:shd w:fill="EAF1F3"/>
+            <w:tcW w:type="dxa" w:w="2160"/>
           </w:tcPr>
           <w:p>
             <w:r>
-              <w:rPr>
-                <w:rFonts w:ascii="Aptos" w:hAnsi="Aptos"/>
-                <w:sz w:val="16"/>
-              </w:rPr>
               <w:t>2026-09-27</w:t>
             </w:r>
           </w:p>
         </w:tc>
         <w:tc>
           <w:tcPr>
-            <w:tcW w:type="dxa" w:w="5548"/>
-            <w:shd w:fill="EAF1F3"/>
+            <w:tcW w:type="dxa" w:w="2160"/>
           </w:tcPr>
           <w:p>
             <w:r>
-              <w:rPr>
-                <w:rFonts w:ascii="Aptos" w:hAnsi="Aptos"/>
-                <w:sz w:val="16"/>
-              </w:rPr>
               <w:t>Living orientation and elapsed rollback</w:t>
             </w:r>
           </w:p>
         </w:tc>
         <w:tc>
           <w:tcPr>
-            <w:tcW w:type="dxa" w:w="1854"/>
-            <w:shd w:fill="EAF1F3"/>
+            <w:tcW w:type="dxa" w:w="2160"/>
           </w:tcPr>
           <w:p>
             <w:r>
-              <w:rPr>
-                <w:rFonts w:ascii="Aptos" w:hAnsi="Aptos"/>
-                <w:sz w:val="16"/>
-              </w:rPr>
-              <w:t>T-001, T-002</w:t>
+              <w:t>[`T-001`](Batches/THREADS.md#t-001), [`T-002`](Batches/THREADS.md#t-002)</w:t>
+            </w:r>
+          </w:p>
+        </w:tc>
+      </w:tr>
+      <w:tr>
+        <w:tc>
+          <w:tcPr>
+            <w:tcW w:type="dxa" w:w="2160"/>
+          </w:tcPr>
+          <w:p>
+            <w:r>
+              <w:t>[A45](Batches/A45-20260928-2155Z-1455PDT-build-42-21-runtime-admission.md)</w:t>
+            </w:r>
+          </w:p>
+        </w:tc>
+        <w:tc>
+          <w:tcPr>
+            <w:tcW w:type="dxa" w:w="2160"/>
+          </w:tcPr>
+          <w:p>
+            <w:r>
+              <w:t>2026-09-28</w:t>
+            </w:r>
+          </w:p>
+        </w:tc>
+        <w:tc>
+          <w:tcPr>
+            <w:tcW w:type="dxa" w:w="2160"/>
+          </w:tcPr>
+          <w:p>
+            <w:r>
+              <w:t>Build 42.21 runtime admission</w:t>
+            </w:r>
+          </w:p>
+        </w:tc>
+        <w:tc>
+          <w:tcPr>
+            <w:tcW w:type="dxa" w:w="2160"/>
+          </w:tcPr>
+          <w:p>
+            <w:r>
+              <w:t>[`T-001`](Batches/THREADS.md#t-001), [`T-002`](Batches/THREADS.md#t-002)</w:t>
             </w:r>
           </w:p>
         </w:tc>
       </w:tr>
     </w:tbl>
+    <w:p/>
+    <w:p>
+      <w:pPr>
+        <w:pStyle w:val="Heading2"/>
+      </w:pPr>
+      <w:r>
+        <w:t>[REPO] 2026-10-09 23:55 UTC - Aggregate development assessment correction</w:t>
+      </w:r>
+    </w:p>
+    <w:p/>
+    <w:p>
+      <w:r>
+        <w:t>Neo maintains current capability and README assessment from ordinary operator feedback, repairs and retained results. This maintenance corrects active playtest/acceptance copy within the existing project; published product chronology and versions remain unchanged. Checks cover the owned text diff, applicable syntax, current source links and tracked Word twins. The operator plays the aggregate build; completed mechanics have no standing one-to-one acceptance queue.</w:t>
+      </w:r>
+    </w:p>
+    <w:p/>
     <w:sectPr>
-      <w:footerReference w:type="default" r:id="rId9"/>
       <w:pgSz w:w="12240" w:h="15840"/>
-      <w:pgMar w:top="749" w:right="1037" w:bottom="749" w:left="1037" w:header="720" w:footer="720" w:gutter="0"/>
+      <w:pgMar w:top="1440" w:right="1800" w:bottom="1440" w:left="1800" w:header="720" w:footer="720" w:gutter="0"/>
       <w:cols w:space="720"/>
       <w:docGrid w:linePitch="360"/>
     </w:sectPr>
   </w:body>
 </w:document>
-</file>
-
-<file path=word/footer1.xml><?xml version="1.0" encoding="utf-8"?>
-<w:ftr xmlns:m="http://schemas.openxmlformats.org/officeDocument/2006/math" xmlns:mc="http://schemas.openxmlformats.org/markup-compatibility/2006" xmlns:mo="http://schemas.microsoft.com/office/mac/office/2008/main" xmlns:mv="urn:schemas-microsoft-com:mac:vml" xmlns:o="urn:schemas-microsoft-com:office:office" xmlns:r="http://schemas.openxmlformats.org/officeDocument/2006/relationships" xmlns:v="urn:schemas-microsoft-com:vml" xmlns:w10="urn:schemas-microsoft-com:office:word" xmlns:w14="http://schemas.microsoft.com/office/word/2010/wordml" xmlns:w="http://schemas.openxmlformats.org/wordprocessingml/2006/main" xmlns:wne="http://schemas.microsoft.com/office/word/2006/wordml" xmlns:wp14="http://schemas.microsoft.com/office/word/2010/wordprocessingDrawing" xmlns:wp="http://schemas.openxmlformats.org/drawingml/2006/wordprocessingDrawing" xmlns:wpc="http://schemas.microsoft.com/office/word/2010/wordprocessingCanvas" xmlns:wpg="http://schemas.microsoft.com/office/word/2010/wordprocessingGroup" xmlns:wpi="http://schemas.microsoft.com/office/word/2010/wordprocessingInk" xmlns:wps="http://schemas.microsoft.com/office/word/2010/wordprocessingShape" mc:Ignorable="w14 wp14">
-  <w:p>
-    <w:pPr>
-      <w:pStyle w:val="Footer"/>
-      <w:jc w:val="center"/>
-    </w:pPr>
-    <w:r>
-      <w:rPr>
-        <w:sz w:val="16"/>
-      </w:rPr>
-      <w:t>Zombie Awareness Overhaul | 0.5.4.0-pre-alpha | A44</w:t>
-    </w:r>
-  </w:p>
-</w:ftr>
 </file>
 
 <file path=word/numbering.xml><?xml version="1.0" encoding="utf-8"?>
@@ -3464,13 +2498,6 @@
     <w:name w:val="Normal"/>
     <w:qFormat/>
     <w:rsid w:val="00FC693F"/>
-    <w:pPr>
-      <w:spacing w:after="70"/>
-    </w:pPr>
-    <w:rPr>
-      <w:rFonts w:ascii="Aptos" w:hAnsi="Aptos"/>
-      <w:sz w:val="18"/>
-    </w:rPr>
   </w:style>
   <w:style w:type="paragraph" w:styleId="Header">
     <w:name w:val="header"/>
@@ -3531,11 +2558,11 @@
       <w:outlineLvl w:val="0"/>
     </w:pPr>
     <w:rPr>
-      <w:rFonts w:asciiTheme="majorHAnsi" w:eastAsiaTheme="majorEastAsia" w:hAnsiTheme="majorHAnsi" w:cstheme="majorBidi" w:ascii="Aptos Display" w:hAnsi="Aptos Display"/>
+      <w:rFonts w:asciiTheme="majorHAnsi" w:eastAsiaTheme="majorEastAsia" w:hAnsiTheme="majorHAnsi" w:cstheme="majorBidi"/>
       <w:b/>
       <w:bCs/>
-      <w:color w:val="316273"/>
-      <w:sz w:val="34"/>
+      <w:color w:val="365F91" w:themeColor="accent1" w:themeShade="BF"/>
+      <w:sz w:val="28"/>
       <w:szCs w:val="28"/>
     </w:rPr>
   </w:style>
@@ -3555,11 +2582,11 @@
       <w:outlineLvl w:val="1"/>
     </w:pPr>
     <w:rPr>
-      <w:rFonts w:asciiTheme="majorHAnsi" w:eastAsiaTheme="majorEastAsia" w:hAnsiTheme="majorHAnsi" w:cstheme="majorBidi" w:ascii="Aptos Display" w:hAnsi="Aptos Display"/>
+      <w:rFonts w:asciiTheme="majorHAnsi" w:eastAsiaTheme="majorEastAsia" w:hAnsiTheme="majorHAnsi" w:cstheme="majorBidi"/>
       <w:b/>
       <w:bCs/>
-      <w:color w:val="316273"/>
-      <w:sz w:val="30"/>
+      <w:color w:val="4F81BD" w:themeColor="accent1"/>
+      <w:sz w:val="26"/>
       <w:szCs w:val="26"/>
     </w:rPr>
   </w:style>
@@ -3579,11 +2606,10 @@
       <w:outlineLvl w:val="2"/>
     </w:pPr>
     <w:rPr>
-      <w:rFonts w:asciiTheme="majorHAnsi" w:eastAsiaTheme="majorEastAsia" w:hAnsiTheme="majorHAnsi" w:cstheme="majorBidi" w:ascii="Aptos Display" w:hAnsi="Aptos Display"/>
+      <w:rFonts w:asciiTheme="majorHAnsi" w:eastAsiaTheme="majorEastAsia" w:hAnsiTheme="majorHAnsi" w:cstheme="majorBidi"/>
       <w:b/>
       <w:bCs/>
-      <w:color w:val="316273"/>
-      <w:sz w:val="26"/>
+      <w:color w:val="4F81BD" w:themeColor="accent1"/>
     </w:rPr>
   </w:style>
   <w:style w:type="paragraph" w:styleId="Heading4">
@@ -3603,13 +2629,12 @@
       <w:outlineLvl w:val="3"/>
     </w:pPr>
     <w:rPr>
-      <w:rFonts w:asciiTheme="majorHAnsi" w:eastAsiaTheme="majorEastAsia" w:hAnsiTheme="majorHAnsi" w:cstheme="majorBidi" w:ascii="Aptos Display" w:hAnsi="Aptos Display"/>
+      <w:rFonts w:asciiTheme="majorHAnsi" w:eastAsiaTheme="majorEastAsia" w:hAnsiTheme="majorHAnsi" w:cstheme="majorBidi"/>
       <w:b/>
       <w:bCs/>
       <w:i/>
       <w:iCs/>
-      <w:color w:val="316273"/>
-      <w:sz w:val="22"/>
+      <w:color w:val="4F81BD" w:themeColor="accent1"/>
     </w:rPr>
   </w:style>
   <w:style w:type="paragraph" w:styleId="Heading5">

</xml_diff>